<commit_message>
Chore(rapport) travail de réparation sur la mise en page du rapport
[15/Done]
</commit_message>
<xml_diff>
--- a/doc/Shoot-me-up-Rapport-EstebanEscher.docx
+++ b/doc/Shoot-me-up-Rapport-EstebanEscher.docx
@@ -169,8 +169,10 @@
           <w:bCs w:val="0"/>
           <w:caps w:val="0"/>
           <w:noProof/>
-          <w:sz w:val="22"/>
-          <w:szCs w:val="22"/>
+          <w:kern w:val="2"/>
+          <w:sz w:val="24"/>
+          <w:szCs w:val="24"/>
+          <w14:ligatures w14:val="standardContextual"/>
         </w:rPr>
       </w:pPr>
       <w:r>
@@ -206,7 +208,7 @@
         </w:rPr>
         <w:fldChar w:fldCharType="separate"/>
       </w:r>
-      <w:hyperlink w:anchor="_Toc308526316" w:history="1">
+      <w:hyperlink w:anchor="_Toc239431411" w:history="1">
         <w:r>
           <w:rPr>
             <w:rStyle w:val="Lienhypertexte"/>
@@ -221,8 +223,10 @@
             <w:bCs w:val="0"/>
             <w:caps w:val="0"/>
             <w:noProof/>
-            <w:sz w:val="22"/>
-            <w:szCs w:val="22"/>
+            <w:kern w:val="2"/>
+            <w:sz w:val="24"/>
+            <w:szCs w:val="24"/>
+            <w14:ligatures w14:val="standardContextual"/>
           </w:rPr>
           <w:tab/>
         </w:r>
@@ -231,7 +235,7 @@
             <w:rStyle w:val="Lienhypertexte"/>
             <w:noProof/>
           </w:rPr>
-          <w:t>Spécifications</w:t>
+          <w:t>Introduction</w:t>
         </w:r>
         <w:r>
           <w:rPr>
@@ -252,7 +256,7 @@
             <w:noProof/>
             <w:webHidden/>
           </w:rPr>
-          <w:instrText xml:space="preserve"> PAGEREF _Toc308526316 \h </w:instrText>
+          <w:instrText xml:space="preserve"> PAGEREF _Toc239431411 \h </w:instrText>
         </w:r>
         <w:r>
           <w:rPr>
@@ -287,51 +291,35 @@
       <w:pPr>
         <w:pStyle w:val="TM2"/>
         <w:tabs>
-          <w:tab w:val="left" w:pos="800"/>
           <w:tab w:val="right" w:leader="dot" w:pos="9060"/>
         </w:tabs>
         <w:rPr>
           <w:rFonts w:eastAsiaTheme="minorEastAsia" w:cstheme="minorBidi"/>
           <w:smallCaps w:val="0"/>
           <w:noProof/>
-          <w:sz w:val="22"/>
-          <w:szCs w:val="22"/>
+          <w:kern w:val="2"/>
+          <w:sz w:val="24"/>
+          <w:szCs w:val="24"/>
+          <w14:ligatures w14:val="standardContextual"/>
         </w:rPr>
       </w:pPr>
-      <w:hyperlink w:anchor="_Toc308526317" w:history="1">
+      <w:hyperlink w:anchor="_Toc239431412" w:history="1">
         <w:r>
           <w:rPr>
             <w:rStyle w:val="Lienhypertexte"/>
             <w:noProof/>
           </w:rPr>
-          <w:t>1.1</w:t>
-        </w:r>
-        <w:r>
-          <w:rPr>
-            <w:rFonts w:eastAsiaTheme="minorEastAsia" w:cstheme="minorBidi"/>
-            <w:smallCaps w:val="0"/>
-            <w:noProof/>
-            <w:sz w:val="22"/>
-            <w:szCs w:val="22"/>
+          <w:t>Titre</w:t>
+        </w:r>
+        <w:r>
+          <w:rPr>
+            <w:noProof/>
+            <w:webHidden/>
           </w:rPr>
           <w:tab/>
         </w:r>
         <w:r>
           <w:rPr>
-            <w:rStyle w:val="Lienhypertexte"/>
-            <w:noProof/>
-          </w:rPr>
-          <w:t>Titre</w:t>
-        </w:r>
-        <w:r>
-          <w:rPr>
-            <w:noProof/>
-            <w:webHidden/>
-          </w:rPr>
-          <w:tab/>
-        </w:r>
-        <w:r>
-          <w:rPr>
             <w:noProof/>
             <w:webHidden/>
           </w:rPr>
@@ -342,7 +330,7 @@
             <w:noProof/>
             <w:webHidden/>
           </w:rPr>
-          <w:instrText xml:space="preserve"> PAGEREF _Toc308526317 \h </w:instrText>
+          <w:instrText xml:space="preserve"> PAGEREF _Toc239431412 \h </w:instrText>
         </w:r>
         <w:r>
           <w:rPr>
@@ -377,51 +365,35 @@
       <w:pPr>
         <w:pStyle w:val="TM2"/>
         <w:tabs>
-          <w:tab w:val="left" w:pos="800"/>
           <w:tab w:val="right" w:leader="dot" w:pos="9060"/>
         </w:tabs>
         <w:rPr>
           <w:rFonts w:eastAsiaTheme="minorEastAsia" w:cstheme="minorBidi"/>
           <w:smallCaps w:val="0"/>
           <w:noProof/>
-          <w:sz w:val="22"/>
-          <w:szCs w:val="22"/>
+          <w:kern w:val="2"/>
+          <w:sz w:val="24"/>
+          <w:szCs w:val="24"/>
+          <w14:ligatures w14:val="standardContextual"/>
         </w:rPr>
       </w:pPr>
-      <w:hyperlink w:anchor="_Toc308526318" w:history="1">
+      <w:hyperlink w:anchor="_Toc239431413" w:history="1">
         <w:r>
           <w:rPr>
             <w:rStyle w:val="Lienhypertexte"/>
             <w:noProof/>
           </w:rPr>
-          <w:t>1.2</w:t>
-        </w:r>
-        <w:r>
-          <w:rPr>
-            <w:rFonts w:eastAsiaTheme="minorEastAsia" w:cstheme="minorBidi"/>
-            <w:smallCaps w:val="0"/>
-            <w:noProof/>
-            <w:sz w:val="22"/>
-            <w:szCs w:val="22"/>
+          <w:t>Objectifs produits</w:t>
+        </w:r>
+        <w:r>
+          <w:rPr>
+            <w:noProof/>
+            <w:webHidden/>
           </w:rPr>
           <w:tab/>
         </w:r>
         <w:r>
           <w:rPr>
-            <w:rStyle w:val="Lienhypertexte"/>
-            <w:noProof/>
-          </w:rPr>
-          <w:t>Description</w:t>
-        </w:r>
-        <w:r>
-          <w:rPr>
-            <w:noProof/>
-            <w:webHidden/>
-          </w:rPr>
-          <w:tab/>
-        </w:r>
-        <w:r>
-          <w:rPr>
             <w:noProof/>
             <w:webHidden/>
           </w:rPr>
@@ -432,7 +404,7 @@
             <w:noProof/>
             <w:webHidden/>
           </w:rPr>
-          <w:instrText xml:space="preserve"> PAGEREF _Toc308526318 \h </w:instrText>
+          <w:instrText xml:space="preserve"> PAGEREF _Toc239431413 \h </w:instrText>
         </w:r>
         <w:r>
           <w:rPr>
@@ -467,51 +439,35 @@
       <w:pPr>
         <w:pStyle w:val="TM2"/>
         <w:tabs>
-          <w:tab w:val="left" w:pos="800"/>
           <w:tab w:val="right" w:leader="dot" w:pos="9060"/>
         </w:tabs>
         <w:rPr>
           <w:rFonts w:eastAsiaTheme="minorEastAsia" w:cstheme="minorBidi"/>
           <w:smallCaps w:val="0"/>
           <w:noProof/>
-          <w:sz w:val="22"/>
-          <w:szCs w:val="22"/>
+          <w:kern w:val="2"/>
+          <w:sz w:val="24"/>
+          <w:szCs w:val="24"/>
+          <w14:ligatures w14:val="standardContextual"/>
         </w:rPr>
       </w:pPr>
-      <w:hyperlink w:anchor="_Toc308526319" w:history="1">
+      <w:hyperlink w:anchor="_Toc239431414" w:history="1">
         <w:r>
           <w:rPr>
             <w:rStyle w:val="Lienhypertexte"/>
             <w:noProof/>
           </w:rPr>
-          <w:t>1.3</w:t>
-        </w:r>
-        <w:r>
-          <w:rPr>
-            <w:rFonts w:eastAsiaTheme="minorEastAsia" w:cstheme="minorBidi"/>
-            <w:smallCaps w:val="0"/>
-            <w:noProof/>
-            <w:sz w:val="22"/>
-            <w:szCs w:val="22"/>
+          <w:t>Objectifs pédagogiques</w:t>
+        </w:r>
+        <w:r>
+          <w:rPr>
+            <w:noProof/>
+            <w:webHidden/>
           </w:rPr>
           <w:tab/>
         </w:r>
         <w:r>
           <w:rPr>
-            <w:rStyle w:val="Lienhypertexte"/>
-            <w:noProof/>
-          </w:rPr>
-          <w:t>Matériel et logiciels à disposition</w:t>
-        </w:r>
-        <w:r>
-          <w:rPr>
-            <w:noProof/>
-            <w:webHidden/>
-          </w:rPr>
-          <w:tab/>
-        </w:r>
-        <w:r>
-          <w:rPr>
             <w:noProof/>
             <w:webHidden/>
           </w:rPr>
@@ -522,7 +478,7 @@
             <w:noProof/>
             <w:webHidden/>
           </w:rPr>
-          <w:instrText xml:space="preserve"> PAGEREF _Toc308526319 \h </w:instrText>
+          <w:instrText xml:space="preserve"> PAGEREF _Toc239431414 \h </w:instrText>
         </w:r>
         <w:r>
           <w:rPr>
@@ -543,1010 +499,6 @@
             <w:webHidden/>
           </w:rPr>
           <w:t>3</w:t>
-        </w:r>
-        <w:r>
-          <w:rPr>
-            <w:noProof/>
-            <w:webHidden/>
-          </w:rPr>
-          <w:fldChar w:fldCharType="end"/>
-        </w:r>
-      </w:hyperlink>
-    </w:p>
-    <w:p>
-      <w:pPr>
-        <w:pStyle w:val="TM2"/>
-        <w:tabs>
-          <w:tab w:val="left" w:pos="800"/>
-          <w:tab w:val="right" w:leader="dot" w:pos="9060"/>
-        </w:tabs>
-        <w:rPr>
-          <w:rFonts w:eastAsiaTheme="minorEastAsia" w:cstheme="minorBidi"/>
-          <w:smallCaps w:val="0"/>
-          <w:noProof/>
-          <w:sz w:val="22"/>
-          <w:szCs w:val="22"/>
-        </w:rPr>
-      </w:pPr>
-      <w:hyperlink w:anchor="_Toc308526320" w:history="1">
-        <w:r>
-          <w:rPr>
-            <w:rStyle w:val="Lienhypertexte"/>
-            <w:noProof/>
-          </w:rPr>
-          <w:t>1.4</w:t>
-        </w:r>
-        <w:r>
-          <w:rPr>
-            <w:rFonts w:eastAsiaTheme="minorEastAsia" w:cstheme="minorBidi"/>
-            <w:smallCaps w:val="0"/>
-            <w:noProof/>
-            <w:sz w:val="22"/>
-            <w:szCs w:val="22"/>
-          </w:rPr>
-          <w:tab/>
-        </w:r>
-        <w:r>
-          <w:rPr>
-            <w:rStyle w:val="Lienhypertexte"/>
-            <w:noProof/>
-          </w:rPr>
-          <w:t>Prérequis</w:t>
-        </w:r>
-        <w:r>
-          <w:rPr>
-            <w:noProof/>
-            <w:webHidden/>
-          </w:rPr>
-          <w:tab/>
-        </w:r>
-        <w:r>
-          <w:rPr>
-            <w:noProof/>
-            <w:webHidden/>
-          </w:rPr>
-          <w:fldChar w:fldCharType="begin"/>
-        </w:r>
-        <w:r>
-          <w:rPr>
-            <w:noProof/>
-            <w:webHidden/>
-          </w:rPr>
-          <w:instrText xml:space="preserve"> PAGEREF _Toc308526320 \h </w:instrText>
-        </w:r>
-        <w:r>
-          <w:rPr>
-            <w:noProof/>
-            <w:webHidden/>
-          </w:rPr>
-        </w:r>
-        <w:r>
-          <w:rPr>
-            <w:noProof/>
-            <w:webHidden/>
-          </w:rPr>
-          <w:fldChar w:fldCharType="separate"/>
-        </w:r>
-        <w:r>
-          <w:rPr>
-            <w:noProof/>
-            <w:webHidden/>
-          </w:rPr>
-          <w:t>3</w:t>
-        </w:r>
-        <w:r>
-          <w:rPr>
-            <w:noProof/>
-            <w:webHidden/>
-          </w:rPr>
-          <w:fldChar w:fldCharType="end"/>
-        </w:r>
-      </w:hyperlink>
-    </w:p>
-    <w:p>
-      <w:pPr>
-        <w:pStyle w:val="TM2"/>
-        <w:tabs>
-          <w:tab w:val="left" w:pos="800"/>
-          <w:tab w:val="right" w:leader="dot" w:pos="9060"/>
-        </w:tabs>
-        <w:rPr>
-          <w:rFonts w:eastAsiaTheme="minorEastAsia" w:cstheme="minorBidi"/>
-          <w:smallCaps w:val="0"/>
-          <w:noProof/>
-          <w:sz w:val="22"/>
-          <w:szCs w:val="22"/>
-        </w:rPr>
-      </w:pPr>
-      <w:hyperlink w:anchor="_Toc308526321" w:history="1">
-        <w:r>
-          <w:rPr>
-            <w:rStyle w:val="Lienhypertexte"/>
-            <w:noProof/>
-          </w:rPr>
-          <w:t>1.5</w:t>
-        </w:r>
-        <w:r>
-          <w:rPr>
-            <w:rFonts w:eastAsiaTheme="minorEastAsia" w:cstheme="minorBidi"/>
-            <w:smallCaps w:val="0"/>
-            <w:noProof/>
-            <w:sz w:val="22"/>
-            <w:szCs w:val="22"/>
-          </w:rPr>
-          <w:tab/>
-        </w:r>
-        <w:r>
-          <w:rPr>
-            <w:rStyle w:val="Lienhypertexte"/>
-            <w:noProof/>
-          </w:rPr>
-          <w:t>Cahier des charges</w:t>
-        </w:r>
-        <w:r>
-          <w:rPr>
-            <w:noProof/>
-            <w:webHidden/>
-          </w:rPr>
-          <w:tab/>
-        </w:r>
-        <w:r>
-          <w:rPr>
-            <w:noProof/>
-            <w:webHidden/>
-          </w:rPr>
-          <w:fldChar w:fldCharType="begin"/>
-        </w:r>
-        <w:r>
-          <w:rPr>
-            <w:noProof/>
-            <w:webHidden/>
-          </w:rPr>
-          <w:instrText xml:space="preserve"> PAGEREF _Toc308526321 \h </w:instrText>
-        </w:r>
-        <w:r>
-          <w:rPr>
-            <w:noProof/>
-            <w:webHidden/>
-          </w:rPr>
-        </w:r>
-        <w:r>
-          <w:rPr>
-            <w:noProof/>
-            <w:webHidden/>
-          </w:rPr>
-          <w:fldChar w:fldCharType="separate"/>
-        </w:r>
-        <w:r>
-          <w:rPr>
-            <w:noProof/>
-            <w:webHidden/>
-          </w:rPr>
-          <w:t>3</w:t>
-        </w:r>
-        <w:r>
-          <w:rPr>
-            <w:noProof/>
-            <w:webHidden/>
-          </w:rPr>
-          <w:fldChar w:fldCharType="end"/>
-        </w:r>
-      </w:hyperlink>
-    </w:p>
-    <w:p>
-      <w:pPr>
-        <w:pStyle w:val="TM3"/>
-        <w:tabs>
-          <w:tab w:val="left" w:pos="1200"/>
-          <w:tab w:val="right" w:leader="dot" w:pos="9060"/>
-        </w:tabs>
-        <w:rPr>
-          <w:rFonts w:eastAsiaTheme="minorEastAsia" w:cstheme="minorBidi"/>
-          <w:i w:val="0"/>
-          <w:iCs w:val="0"/>
-          <w:noProof/>
-          <w:sz w:val="22"/>
-          <w:szCs w:val="22"/>
-        </w:rPr>
-      </w:pPr>
-      <w:hyperlink w:anchor="_Toc308526322" w:history="1">
-        <w:r>
-          <w:rPr>
-            <w:rStyle w:val="Lienhypertexte"/>
-            <w:noProof/>
-          </w:rPr>
-          <w:t>1.5.1</w:t>
-        </w:r>
-        <w:r>
-          <w:rPr>
-            <w:rFonts w:eastAsiaTheme="minorEastAsia" w:cstheme="minorBidi"/>
-            <w:i w:val="0"/>
-            <w:iCs w:val="0"/>
-            <w:noProof/>
-            <w:sz w:val="22"/>
-            <w:szCs w:val="22"/>
-          </w:rPr>
-          <w:tab/>
-        </w:r>
-        <w:r>
-          <w:rPr>
-            <w:rStyle w:val="Lienhypertexte"/>
-            <w:noProof/>
-          </w:rPr>
-          <w:t>Objectifs et portée du projet (objectifs SMART)</w:t>
-        </w:r>
-        <w:r>
-          <w:rPr>
-            <w:noProof/>
-            <w:webHidden/>
-          </w:rPr>
-          <w:tab/>
-        </w:r>
-        <w:r>
-          <w:rPr>
-            <w:noProof/>
-            <w:webHidden/>
-          </w:rPr>
-          <w:fldChar w:fldCharType="begin"/>
-        </w:r>
-        <w:r>
-          <w:rPr>
-            <w:noProof/>
-            <w:webHidden/>
-          </w:rPr>
-          <w:instrText xml:space="preserve"> PAGEREF _Toc308526322 \h </w:instrText>
-        </w:r>
-        <w:r>
-          <w:rPr>
-            <w:noProof/>
-            <w:webHidden/>
-          </w:rPr>
-        </w:r>
-        <w:r>
-          <w:rPr>
-            <w:noProof/>
-            <w:webHidden/>
-          </w:rPr>
-          <w:fldChar w:fldCharType="separate"/>
-        </w:r>
-        <w:r>
-          <w:rPr>
-            <w:noProof/>
-            <w:webHidden/>
-          </w:rPr>
-          <w:t>3</w:t>
-        </w:r>
-        <w:r>
-          <w:rPr>
-            <w:noProof/>
-            <w:webHidden/>
-          </w:rPr>
-          <w:fldChar w:fldCharType="end"/>
-        </w:r>
-      </w:hyperlink>
-    </w:p>
-    <w:p>
-      <w:pPr>
-        <w:pStyle w:val="TM3"/>
-        <w:tabs>
-          <w:tab w:val="left" w:pos="1200"/>
-          <w:tab w:val="right" w:leader="dot" w:pos="9060"/>
-        </w:tabs>
-        <w:rPr>
-          <w:rFonts w:eastAsiaTheme="minorEastAsia" w:cstheme="minorBidi"/>
-          <w:i w:val="0"/>
-          <w:iCs w:val="0"/>
-          <w:noProof/>
-          <w:sz w:val="22"/>
-          <w:szCs w:val="22"/>
-        </w:rPr>
-      </w:pPr>
-      <w:hyperlink w:anchor="_Toc308526323" w:history="1">
-        <w:r>
-          <w:rPr>
-            <w:rStyle w:val="Lienhypertexte"/>
-            <w:noProof/>
-          </w:rPr>
-          <w:t>1.5.2</w:t>
-        </w:r>
-        <w:r>
-          <w:rPr>
-            <w:rFonts w:eastAsiaTheme="minorEastAsia" w:cstheme="minorBidi"/>
-            <w:i w:val="0"/>
-            <w:iCs w:val="0"/>
-            <w:noProof/>
-            <w:sz w:val="22"/>
-            <w:szCs w:val="22"/>
-          </w:rPr>
-          <w:tab/>
-        </w:r>
-        <w:r>
-          <w:rPr>
-            <w:rStyle w:val="Lienhypertexte"/>
-            <w:noProof/>
-          </w:rPr>
-          <w:t>Caractéristiques des utilisateurs et impacts</w:t>
-        </w:r>
-        <w:r>
-          <w:rPr>
-            <w:noProof/>
-            <w:webHidden/>
-          </w:rPr>
-          <w:tab/>
-        </w:r>
-        <w:r>
-          <w:rPr>
-            <w:noProof/>
-            <w:webHidden/>
-          </w:rPr>
-          <w:fldChar w:fldCharType="begin"/>
-        </w:r>
-        <w:r>
-          <w:rPr>
-            <w:noProof/>
-            <w:webHidden/>
-          </w:rPr>
-          <w:instrText xml:space="preserve"> PAGEREF _Toc308526323 \h </w:instrText>
-        </w:r>
-        <w:r>
-          <w:rPr>
-            <w:noProof/>
-            <w:webHidden/>
-          </w:rPr>
-        </w:r>
-        <w:r>
-          <w:rPr>
-            <w:noProof/>
-            <w:webHidden/>
-          </w:rPr>
-          <w:fldChar w:fldCharType="separate"/>
-        </w:r>
-        <w:r>
-          <w:rPr>
-            <w:noProof/>
-            <w:webHidden/>
-          </w:rPr>
-          <w:t>3</w:t>
-        </w:r>
-        <w:r>
-          <w:rPr>
-            <w:noProof/>
-            <w:webHidden/>
-          </w:rPr>
-          <w:fldChar w:fldCharType="end"/>
-        </w:r>
-      </w:hyperlink>
-    </w:p>
-    <w:p>
-      <w:pPr>
-        <w:pStyle w:val="TM3"/>
-        <w:tabs>
-          <w:tab w:val="left" w:pos="1200"/>
-          <w:tab w:val="right" w:leader="dot" w:pos="9060"/>
-        </w:tabs>
-        <w:rPr>
-          <w:rFonts w:eastAsiaTheme="minorEastAsia" w:cstheme="minorBidi"/>
-          <w:i w:val="0"/>
-          <w:iCs w:val="0"/>
-          <w:noProof/>
-          <w:sz w:val="22"/>
-          <w:szCs w:val="22"/>
-        </w:rPr>
-      </w:pPr>
-      <w:hyperlink w:anchor="_Toc308526324" w:history="1">
-        <w:r>
-          <w:rPr>
-            <w:rStyle w:val="Lienhypertexte"/>
-            <w:noProof/>
-          </w:rPr>
-          <w:t>1.5.3</w:t>
-        </w:r>
-        <w:r>
-          <w:rPr>
-            <w:rFonts w:eastAsiaTheme="minorEastAsia" w:cstheme="minorBidi"/>
-            <w:i w:val="0"/>
-            <w:iCs w:val="0"/>
-            <w:noProof/>
-            <w:sz w:val="22"/>
-            <w:szCs w:val="22"/>
-          </w:rPr>
-          <w:tab/>
-        </w:r>
-        <w:r>
-          <w:rPr>
-            <w:rStyle w:val="Lienhypertexte"/>
-            <w:noProof/>
-          </w:rPr>
-          <w:t>Fonctionnalités requises (du point de vue de l’utilisateur)</w:t>
-        </w:r>
-        <w:r>
-          <w:rPr>
-            <w:noProof/>
-            <w:webHidden/>
-          </w:rPr>
-          <w:tab/>
-        </w:r>
-        <w:r>
-          <w:rPr>
-            <w:noProof/>
-            <w:webHidden/>
-          </w:rPr>
-          <w:fldChar w:fldCharType="begin"/>
-        </w:r>
-        <w:r>
-          <w:rPr>
-            <w:noProof/>
-            <w:webHidden/>
-          </w:rPr>
-          <w:instrText xml:space="preserve"> PAGEREF _Toc308526324 \h </w:instrText>
-        </w:r>
-        <w:r>
-          <w:rPr>
-            <w:noProof/>
-            <w:webHidden/>
-          </w:rPr>
-        </w:r>
-        <w:r>
-          <w:rPr>
-            <w:noProof/>
-            <w:webHidden/>
-          </w:rPr>
-          <w:fldChar w:fldCharType="separate"/>
-        </w:r>
-        <w:r>
-          <w:rPr>
-            <w:noProof/>
-            <w:webHidden/>
-          </w:rPr>
-          <w:t>3</w:t>
-        </w:r>
-        <w:r>
-          <w:rPr>
-            <w:noProof/>
-            <w:webHidden/>
-          </w:rPr>
-          <w:fldChar w:fldCharType="end"/>
-        </w:r>
-      </w:hyperlink>
-    </w:p>
-    <w:p>
-      <w:pPr>
-        <w:pStyle w:val="TM3"/>
-        <w:tabs>
-          <w:tab w:val="left" w:pos="1200"/>
-          <w:tab w:val="right" w:leader="dot" w:pos="9060"/>
-        </w:tabs>
-        <w:rPr>
-          <w:rFonts w:eastAsiaTheme="minorEastAsia" w:cstheme="minorBidi"/>
-          <w:i w:val="0"/>
-          <w:iCs w:val="0"/>
-          <w:noProof/>
-          <w:sz w:val="22"/>
-          <w:szCs w:val="22"/>
-        </w:rPr>
-      </w:pPr>
-      <w:hyperlink w:anchor="_Toc308526325" w:history="1">
-        <w:r>
-          <w:rPr>
-            <w:rStyle w:val="Lienhypertexte"/>
-            <w:noProof/>
-          </w:rPr>
-          <w:t>1.5.4</w:t>
-        </w:r>
-        <w:r>
-          <w:rPr>
-            <w:rFonts w:eastAsiaTheme="minorEastAsia" w:cstheme="minorBidi"/>
-            <w:i w:val="0"/>
-            <w:iCs w:val="0"/>
-            <w:noProof/>
-            <w:sz w:val="22"/>
-            <w:szCs w:val="22"/>
-          </w:rPr>
-          <w:tab/>
-        </w:r>
-        <w:r>
-          <w:rPr>
-            <w:rStyle w:val="Lienhypertexte"/>
-            <w:noProof/>
-          </w:rPr>
-          <w:t>Contraintes</w:t>
-        </w:r>
-        <w:r>
-          <w:rPr>
-            <w:noProof/>
-            <w:webHidden/>
-          </w:rPr>
-          <w:tab/>
-        </w:r>
-        <w:r>
-          <w:rPr>
-            <w:noProof/>
-            <w:webHidden/>
-          </w:rPr>
-          <w:fldChar w:fldCharType="begin"/>
-        </w:r>
-        <w:r>
-          <w:rPr>
-            <w:noProof/>
-            <w:webHidden/>
-          </w:rPr>
-          <w:instrText xml:space="preserve"> PAGEREF _Toc308526325 \h </w:instrText>
-        </w:r>
-        <w:r>
-          <w:rPr>
-            <w:noProof/>
-            <w:webHidden/>
-          </w:rPr>
-        </w:r>
-        <w:r>
-          <w:rPr>
-            <w:noProof/>
-            <w:webHidden/>
-          </w:rPr>
-          <w:fldChar w:fldCharType="separate"/>
-        </w:r>
-        <w:r>
-          <w:rPr>
-            <w:noProof/>
-            <w:webHidden/>
-          </w:rPr>
-          <w:t>3</w:t>
-        </w:r>
-        <w:r>
-          <w:rPr>
-            <w:noProof/>
-            <w:webHidden/>
-          </w:rPr>
-          <w:fldChar w:fldCharType="end"/>
-        </w:r>
-      </w:hyperlink>
-    </w:p>
-    <w:p>
-      <w:pPr>
-        <w:pStyle w:val="TM3"/>
-        <w:tabs>
-          <w:tab w:val="left" w:pos="1200"/>
-          <w:tab w:val="right" w:leader="dot" w:pos="9060"/>
-        </w:tabs>
-        <w:rPr>
-          <w:rFonts w:eastAsiaTheme="minorEastAsia" w:cstheme="minorBidi"/>
-          <w:i w:val="0"/>
-          <w:iCs w:val="0"/>
-          <w:noProof/>
-          <w:sz w:val="22"/>
-          <w:szCs w:val="22"/>
-        </w:rPr>
-      </w:pPr>
-      <w:hyperlink w:anchor="_Toc308526326" w:history="1">
-        <w:r>
-          <w:rPr>
-            <w:rStyle w:val="Lienhypertexte"/>
-            <w:noProof/>
-          </w:rPr>
-          <w:t>1.5.5</w:t>
-        </w:r>
-        <w:r>
-          <w:rPr>
-            <w:rFonts w:eastAsiaTheme="minorEastAsia" w:cstheme="minorBidi"/>
-            <w:i w:val="0"/>
-            <w:iCs w:val="0"/>
-            <w:noProof/>
-            <w:sz w:val="22"/>
-            <w:szCs w:val="22"/>
-          </w:rPr>
-          <w:tab/>
-        </w:r>
-        <w:r>
-          <w:rPr>
-            <w:rStyle w:val="Lienhypertexte"/>
-            <w:noProof/>
-          </w:rPr>
-          <w:t>Travail à réaliser par l'apprenti</w:t>
-        </w:r>
-        <w:r>
-          <w:rPr>
-            <w:noProof/>
-            <w:webHidden/>
-          </w:rPr>
-          <w:tab/>
-        </w:r>
-        <w:r>
-          <w:rPr>
-            <w:noProof/>
-            <w:webHidden/>
-          </w:rPr>
-          <w:fldChar w:fldCharType="begin"/>
-        </w:r>
-        <w:r>
-          <w:rPr>
-            <w:noProof/>
-            <w:webHidden/>
-          </w:rPr>
-          <w:instrText xml:space="preserve"> PAGEREF _Toc308526326 \h </w:instrText>
-        </w:r>
-        <w:r>
-          <w:rPr>
-            <w:noProof/>
-            <w:webHidden/>
-          </w:rPr>
-        </w:r>
-        <w:r>
-          <w:rPr>
-            <w:noProof/>
-            <w:webHidden/>
-          </w:rPr>
-          <w:fldChar w:fldCharType="separate"/>
-        </w:r>
-        <w:r>
-          <w:rPr>
-            <w:noProof/>
-            <w:webHidden/>
-          </w:rPr>
-          <w:t>4</w:t>
-        </w:r>
-        <w:r>
-          <w:rPr>
-            <w:noProof/>
-            <w:webHidden/>
-          </w:rPr>
-          <w:fldChar w:fldCharType="end"/>
-        </w:r>
-      </w:hyperlink>
-    </w:p>
-    <w:p>
-      <w:pPr>
-        <w:pStyle w:val="TM3"/>
-        <w:tabs>
-          <w:tab w:val="left" w:pos="1200"/>
-          <w:tab w:val="right" w:leader="dot" w:pos="9060"/>
-        </w:tabs>
-        <w:rPr>
-          <w:rFonts w:eastAsiaTheme="minorEastAsia" w:cstheme="minorBidi"/>
-          <w:i w:val="0"/>
-          <w:iCs w:val="0"/>
-          <w:noProof/>
-          <w:sz w:val="22"/>
-          <w:szCs w:val="22"/>
-        </w:rPr>
-      </w:pPr>
-      <w:hyperlink w:anchor="_Toc308526327" w:history="1">
-        <w:r>
-          <w:rPr>
-            <w:rStyle w:val="Lienhypertexte"/>
-            <w:noProof/>
-          </w:rPr>
-          <w:t>1.5.6</w:t>
-        </w:r>
-        <w:r>
-          <w:rPr>
-            <w:rFonts w:eastAsiaTheme="minorEastAsia" w:cstheme="minorBidi"/>
-            <w:i w:val="0"/>
-            <w:iCs w:val="0"/>
-            <w:noProof/>
-            <w:sz w:val="22"/>
-            <w:szCs w:val="22"/>
-          </w:rPr>
-          <w:tab/>
-        </w:r>
-        <w:r>
-          <w:rPr>
-            <w:rStyle w:val="Lienhypertexte"/>
-            <w:noProof/>
-          </w:rPr>
-          <w:t>Si le temps le permet …</w:t>
-        </w:r>
-        <w:r>
-          <w:rPr>
-            <w:noProof/>
-            <w:webHidden/>
-          </w:rPr>
-          <w:tab/>
-        </w:r>
-        <w:r>
-          <w:rPr>
-            <w:noProof/>
-            <w:webHidden/>
-          </w:rPr>
-          <w:fldChar w:fldCharType="begin"/>
-        </w:r>
-        <w:r>
-          <w:rPr>
-            <w:noProof/>
-            <w:webHidden/>
-          </w:rPr>
-          <w:instrText xml:space="preserve"> PAGEREF _Toc308526327 \h </w:instrText>
-        </w:r>
-        <w:r>
-          <w:rPr>
-            <w:noProof/>
-            <w:webHidden/>
-          </w:rPr>
-        </w:r>
-        <w:r>
-          <w:rPr>
-            <w:noProof/>
-            <w:webHidden/>
-          </w:rPr>
-          <w:fldChar w:fldCharType="separate"/>
-        </w:r>
-        <w:r>
-          <w:rPr>
-            <w:noProof/>
-            <w:webHidden/>
-          </w:rPr>
-          <w:t>4</w:t>
-        </w:r>
-        <w:r>
-          <w:rPr>
-            <w:noProof/>
-            <w:webHidden/>
-          </w:rPr>
-          <w:fldChar w:fldCharType="end"/>
-        </w:r>
-      </w:hyperlink>
-    </w:p>
-    <w:p>
-      <w:pPr>
-        <w:pStyle w:val="TM3"/>
-        <w:tabs>
-          <w:tab w:val="left" w:pos="1200"/>
-          <w:tab w:val="right" w:leader="dot" w:pos="9060"/>
-        </w:tabs>
-        <w:rPr>
-          <w:rFonts w:eastAsiaTheme="minorEastAsia" w:cstheme="minorBidi"/>
-          <w:i w:val="0"/>
-          <w:iCs w:val="0"/>
-          <w:noProof/>
-          <w:sz w:val="22"/>
-          <w:szCs w:val="22"/>
-        </w:rPr>
-      </w:pPr>
-      <w:hyperlink w:anchor="_Toc308526328" w:history="1">
-        <w:r>
-          <w:rPr>
-            <w:rStyle w:val="Lienhypertexte"/>
-            <w:noProof/>
-          </w:rPr>
-          <w:t>1.5.7</w:t>
-        </w:r>
-        <w:r>
-          <w:rPr>
-            <w:rFonts w:eastAsiaTheme="minorEastAsia" w:cstheme="minorBidi"/>
-            <w:i w:val="0"/>
-            <w:iCs w:val="0"/>
-            <w:noProof/>
-            <w:sz w:val="22"/>
-            <w:szCs w:val="22"/>
-          </w:rPr>
-          <w:tab/>
-        </w:r>
-        <w:r>
-          <w:rPr>
-            <w:rStyle w:val="Lienhypertexte"/>
-            <w:noProof/>
-          </w:rPr>
-          <w:t>Méthodes de validation des solutions</w:t>
-        </w:r>
-        <w:r>
-          <w:rPr>
-            <w:noProof/>
-            <w:webHidden/>
-          </w:rPr>
-          <w:tab/>
-        </w:r>
-        <w:r>
-          <w:rPr>
-            <w:noProof/>
-            <w:webHidden/>
-          </w:rPr>
-          <w:fldChar w:fldCharType="begin"/>
-        </w:r>
-        <w:r>
-          <w:rPr>
-            <w:noProof/>
-            <w:webHidden/>
-          </w:rPr>
-          <w:instrText xml:space="preserve"> PAGEREF _Toc308526328 \h </w:instrText>
-        </w:r>
-        <w:r>
-          <w:rPr>
-            <w:noProof/>
-            <w:webHidden/>
-          </w:rPr>
-        </w:r>
-        <w:r>
-          <w:rPr>
-            <w:noProof/>
-            <w:webHidden/>
-          </w:rPr>
-          <w:fldChar w:fldCharType="separate"/>
-        </w:r>
-        <w:r>
-          <w:rPr>
-            <w:noProof/>
-            <w:webHidden/>
-          </w:rPr>
-          <w:t>4</w:t>
-        </w:r>
-        <w:r>
-          <w:rPr>
-            <w:noProof/>
-            <w:webHidden/>
-          </w:rPr>
-          <w:fldChar w:fldCharType="end"/>
-        </w:r>
-      </w:hyperlink>
-    </w:p>
-    <w:p>
-      <w:pPr>
-        <w:pStyle w:val="TM2"/>
-        <w:tabs>
-          <w:tab w:val="left" w:pos="800"/>
-          <w:tab w:val="right" w:leader="dot" w:pos="9060"/>
-        </w:tabs>
-        <w:rPr>
-          <w:rFonts w:eastAsiaTheme="minorEastAsia" w:cstheme="minorBidi"/>
-          <w:smallCaps w:val="0"/>
-          <w:noProof/>
-          <w:sz w:val="22"/>
-          <w:szCs w:val="22"/>
-        </w:rPr>
-      </w:pPr>
-      <w:hyperlink w:anchor="_Toc308526329" w:history="1">
-        <w:r>
-          <w:rPr>
-            <w:rStyle w:val="Lienhypertexte"/>
-            <w:noProof/>
-          </w:rPr>
-          <w:t>1.6</w:t>
-        </w:r>
-        <w:r>
-          <w:rPr>
-            <w:rFonts w:eastAsiaTheme="minorEastAsia" w:cstheme="minorBidi"/>
-            <w:smallCaps w:val="0"/>
-            <w:noProof/>
-            <w:sz w:val="22"/>
-            <w:szCs w:val="22"/>
-          </w:rPr>
-          <w:tab/>
-        </w:r>
-        <w:r>
-          <w:rPr>
-            <w:rStyle w:val="Lienhypertexte"/>
-            <w:noProof/>
-          </w:rPr>
-          <w:t>Les points suivants seront évalués</w:t>
-        </w:r>
-        <w:r>
-          <w:rPr>
-            <w:noProof/>
-            <w:webHidden/>
-          </w:rPr>
-          <w:tab/>
-        </w:r>
-        <w:r>
-          <w:rPr>
-            <w:noProof/>
-            <w:webHidden/>
-          </w:rPr>
-          <w:fldChar w:fldCharType="begin"/>
-        </w:r>
-        <w:r>
-          <w:rPr>
-            <w:noProof/>
-            <w:webHidden/>
-          </w:rPr>
-          <w:instrText xml:space="preserve"> PAGEREF _Toc308526329 \h </w:instrText>
-        </w:r>
-        <w:r>
-          <w:rPr>
-            <w:noProof/>
-            <w:webHidden/>
-          </w:rPr>
-        </w:r>
-        <w:r>
-          <w:rPr>
-            <w:noProof/>
-            <w:webHidden/>
-          </w:rPr>
-          <w:fldChar w:fldCharType="separate"/>
-        </w:r>
-        <w:r>
-          <w:rPr>
-            <w:noProof/>
-            <w:webHidden/>
-          </w:rPr>
-          <w:t>4</w:t>
-        </w:r>
-        <w:r>
-          <w:rPr>
-            <w:noProof/>
-            <w:webHidden/>
-          </w:rPr>
-          <w:fldChar w:fldCharType="end"/>
-        </w:r>
-      </w:hyperlink>
-    </w:p>
-    <w:p>
-      <w:pPr>
-        <w:pStyle w:val="TM2"/>
-        <w:tabs>
-          <w:tab w:val="left" w:pos="800"/>
-          <w:tab w:val="right" w:leader="dot" w:pos="9060"/>
-        </w:tabs>
-        <w:rPr>
-          <w:rFonts w:eastAsiaTheme="minorEastAsia" w:cstheme="minorBidi"/>
-          <w:smallCaps w:val="0"/>
-          <w:noProof/>
-          <w:sz w:val="22"/>
-          <w:szCs w:val="22"/>
-        </w:rPr>
-      </w:pPr>
-      <w:hyperlink w:anchor="_Toc308526330" w:history="1">
-        <w:r>
-          <w:rPr>
-            <w:rStyle w:val="Lienhypertexte"/>
-            <w:noProof/>
-          </w:rPr>
-          <w:t>1.7</w:t>
-        </w:r>
-        <w:r>
-          <w:rPr>
-            <w:rFonts w:eastAsiaTheme="minorEastAsia" w:cstheme="minorBidi"/>
-            <w:smallCaps w:val="0"/>
-            <w:noProof/>
-            <w:sz w:val="22"/>
-            <w:szCs w:val="22"/>
-          </w:rPr>
-          <w:tab/>
-        </w:r>
-        <w:r>
-          <w:rPr>
-            <w:rStyle w:val="Lienhypertexte"/>
-            <w:noProof/>
-          </w:rPr>
-          <w:t>Validation et conditions de réussite</w:t>
-        </w:r>
-        <w:r>
-          <w:rPr>
-            <w:noProof/>
-            <w:webHidden/>
-          </w:rPr>
-          <w:tab/>
-        </w:r>
-        <w:r>
-          <w:rPr>
-            <w:noProof/>
-            <w:webHidden/>
-          </w:rPr>
-          <w:fldChar w:fldCharType="begin"/>
-        </w:r>
-        <w:r>
-          <w:rPr>
-            <w:noProof/>
-            <w:webHidden/>
-          </w:rPr>
-          <w:instrText xml:space="preserve"> PAGEREF _Toc308526330 \h </w:instrText>
-        </w:r>
-        <w:r>
-          <w:rPr>
-            <w:noProof/>
-            <w:webHidden/>
-          </w:rPr>
-        </w:r>
-        <w:r>
-          <w:rPr>
-            <w:noProof/>
-            <w:webHidden/>
-          </w:rPr>
-          <w:fldChar w:fldCharType="separate"/>
-        </w:r>
-        <w:r>
-          <w:rPr>
-            <w:noProof/>
-            <w:webHidden/>
-          </w:rPr>
-          <w:t>4</w:t>
         </w:r>
         <w:r>
           <w:rPr>
@@ -1570,11 +522,13 @@
           <w:bCs w:val="0"/>
           <w:caps w:val="0"/>
           <w:noProof/>
-          <w:sz w:val="22"/>
-          <w:szCs w:val="22"/>
+          <w:kern w:val="2"/>
+          <w:sz w:val="24"/>
+          <w:szCs w:val="24"/>
+          <w14:ligatures w14:val="standardContextual"/>
         </w:rPr>
       </w:pPr>
-      <w:hyperlink w:anchor="_Toc308526331" w:history="1">
+      <w:hyperlink w:anchor="_Toc239431415" w:history="1">
         <w:r>
           <w:rPr>
             <w:rStyle w:val="Lienhypertexte"/>
@@ -1589,8 +543,10 @@
             <w:bCs w:val="0"/>
             <w:caps w:val="0"/>
             <w:noProof/>
-            <w:sz w:val="22"/>
-            <w:szCs w:val="22"/>
+            <w:kern w:val="2"/>
+            <w:sz w:val="24"/>
+            <w:szCs w:val="24"/>
+            <w14:ligatures w14:val="standardContextual"/>
           </w:rPr>
           <w:tab/>
         </w:r>
@@ -1620,7 +576,7 @@
             <w:noProof/>
             <w:webHidden/>
           </w:rPr>
-          <w:instrText xml:space="preserve"> PAGEREF _Toc308526331 \h </w:instrText>
+          <w:instrText xml:space="preserve"> PAGEREF _Toc239431415 \h </w:instrText>
         </w:r>
         <w:r>
           <w:rPr>
@@ -1640,7 +596,7 @@
             <w:noProof/>
             <w:webHidden/>
           </w:rPr>
-          <w:t>4</w:t>
+          <w:t>3</w:t>
         </w:r>
         <w:r>
           <w:rPr>
@@ -1664,11 +620,13 @@
           <w:bCs w:val="0"/>
           <w:caps w:val="0"/>
           <w:noProof/>
-          <w:sz w:val="22"/>
-          <w:szCs w:val="22"/>
+          <w:kern w:val="2"/>
+          <w:sz w:val="24"/>
+          <w:szCs w:val="24"/>
+          <w14:ligatures w14:val="standardContextual"/>
         </w:rPr>
       </w:pPr>
-      <w:hyperlink w:anchor="_Toc308526332" w:history="1">
+      <w:hyperlink w:anchor="_Toc239431416" w:history="1">
         <w:r>
           <w:rPr>
             <w:rStyle w:val="Lienhypertexte"/>
@@ -1683,8 +641,10 @@
             <w:bCs w:val="0"/>
             <w:caps w:val="0"/>
             <w:noProof/>
-            <w:sz w:val="22"/>
-            <w:szCs w:val="22"/>
+            <w:kern w:val="2"/>
+            <w:sz w:val="24"/>
+            <w:szCs w:val="24"/>
+            <w14:ligatures w14:val="standardContextual"/>
           </w:rPr>
           <w:tab/>
         </w:r>
@@ -1714,7 +674,7 @@
             <w:noProof/>
             <w:webHidden/>
           </w:rPr>
-          <w:instrText xml:space="preserve"> PAGEREF _Toc308526332 \h </w:instrText>
+          <w:instrText xml:space="preserve"> PAGEREF _Toc239431416 \h </w:instrText>
         </w:r>
         <w:r>
           <w:rPr>
@@ -1734,7 +694,7 @@
             <w:noProof/>
             <w:webHidden/>
           </w:rPr>
-          <w:t>4</w:t>
+          <w:t>3</w:t>
         </w:r>
         <w:r>
           <w:rPr>
@@ -1749,32 +709,112 @@
       <w:pPr>
         <w:pStyle w:val="TM2"/>
         <w:tabs>
-          <w:tab w:val="left" w:pos="800"/>
           <w:tab w:val="right" w:leader="dot" w:pos="9060"/>
         </w:tabs>
         <w:rPr>
           <w:rFonts w:eastAsiaTheme="minorEastAsia" w:cstheme="minorBidi"/>
           <w:smallCaps w:val="0"/>
           <w:noProof/>
-          <w:sz w:val="22"/>
-          <w:szCs w:val="22"/>
+          <w:kern w:val="2"/>
+          <w:sz w:val="24"/>
+          <w:szCs w:val="24"/>
+          <w14:ligatures w14:val="standardContextual"/>
         </w:rPr>
       </w:pPr>
-      <w:hyperlink w:anchor="_Toc308526333" w:history="1">
+      <w:hyperlink w:anchor="_Toc239431417" w:history="1">
         <w:r>
           <w:rPr>
             <w:rStyle w:val="Lienhypertexte"/>
             <w:noProof/>
           </w:rPr>
-          <w:t>3.1</w:t>
+          <w:t>User story</w:t>
+        </w:r>
+        <w:r>
+          <w:rPr>
+            <w:noProof/>
+            <w:webHidden/>
+          </w:rPr>
+          <w:tab/>
+        </w:r>
+        <w:r>
+          <w:rPr>
+            <w:noProof/>
+            <w:webHidden/>
+          </w:rPr>
+          <w:fldChar w:fldCharType="begin"/>
+        </w:r>
+        <w:r>
+          <w:rPr>
+            <w:noProof/>
+            <w:webHidden/>
+          </w:rPr>
+          <w:instrText xml:space="preserve"> PAGEREF _Toc239431417 \h </w:instrText>
+        </w:r>
+        <w:r>
+          <w:rPr>
+            <w:noProof/>
+            <w:webHidden/>
+          </w:rPr>
+        </w:r>
+        <w:r>
+          <w:rPr>
+            <w:noProof/>
+            <w:webHidden/>
+          </w:rPr>
+          <w:fldChar w:fldCharType="separate"/>
+        </w:r>
+        <w:r>
+          <w:rPr>
+            <w:noProof/>
+            <w:webHidden/>
+          </w:rPr>
+          <w:t>3</w:t>
+        </w:r>
+        <w:r>
+          <w:rPr>
+            <w:noProof/>
+            <w:webHidden/>
+          </w:rPr>
+          <w:fldChar w:fldCharType="end"/>
+        </w:r>
+      </w:hyperlink>
+    </w:p>
+    <w:p>
+      <w:pPr>
+        <w:pStyle w:val="TM3"/>
+        <w:tabs>
+          <w:tab w:val="left" w:pos="1200"/>
+          <w:tab w:val="right" w:leader="dot" w:pos="9060"/>
+        </w:tabs>
+        <w:rPr>
+          <w:rFonts w:eastAsiaTheme="minorEastAsia" w:cstheme="minorBidi"/>
+          <w:i w:val="0"/>
+          <w:iCs w:val="0"/>
+          <w:noProof/>
+          <w:kern w:val="2"/>
+          <w:sz w:val="24"/>
+          <w:szCs w:val="24"/>
+          <w14:ligatures w14:val="standardContextual"/>
+        </w:rPr>
+      </w:pPr>
+      <w:hyperlink w:anchor="_Toc239431418" w:history="1">
+        <w:r>
+          <w:rPr>
+            <w:rStyle w:val="Lienhypertexte"/>
+            <w:noProof/>
+          </w:rPr>
+          <w:t>3.1.1</w:t>
         </w:r>
         <w:r>
           <w:rPr>
             <w:rFonts w:eastAsiaTheme="minorEastAsia" w:cstheme="minorBidi"/>
-            <w:smallCaps w:val="0"/>
-            <w:noProof/>
-            <w:sz w:val="22"/>
-            <w:szCs w:val="22"/>
+            <w:i w:val="0"/>
+            <w:iCs w:val="0"/>
+            <w:noProof/>
+            <w:kern w:val="2"/>
+            <w:sz w:val="24"/>
+            <w:szCs w:val="24"/>
+            <w14:ligatures w14:val="standardContextual"/>
           </w:rPr>
           <w:tab/>
         </w:r>
@@ -1783,7 +823,7 @@
             <w:rStyle w:val="Lienhypertexte"/>
             <w:noProof/>
           </w:rPr>
-          <w:t>Opportunités</w:t>
+          <w:t>#1 — US1: Déplacement du joueur</w:t>
         </w:r>
         <w:r>
           <w:rPr>
@@ -1804,7 +844,7 @@
             <w:noProof/>
             <w:webHidden/>
           </w:rPr>
-          <w:instrText xml:space="preserve"> PAGEREF _Toc308526333 \h </w:instrText>
+          <w:instrText xml:space="preserve"> PAGEREF _Toc239431418 \h </w:instrText>
         </w:r>
         <w:r>
           <w:rPr>
@@ -1824,7 +864,7 @@
             <w:noProof/>
             <w:webHidden/>
           </w:rPr>
-          <w:t>4</w:t>
+          <w:t>3</w:t>
         </w:r>
         <w:r>
           <w:rPr>
@@ -1839,51 +879,35 @@
       <w:pPr>
         <w:pStyle w:val="TM2"/>
         <w:tabs>
-          <w:tab w:val="left" w:pos="800"/>
           <w:tab w:val="right" w:leader="dot" w:pos="9060"/>
         </w:tabs>
         <w:rPr>
           <w:rFonts w:eastAsiaTheme="minorEastAsia" w:cstheme="minorBidi"/>
           <w:smallCaps w:val="0"/>
           <w:noProof/>
-          <w:sz w:val="22"/>
-          <w:szCs w:val="22"/>
+          <w:kern w:val="2"/>
+          <w:sz w:val="24"/>
+          <w:szCs w:val="24"/>
+          <w14:ligatures w14:val="standardContextual"/>
         </w:rPr>
       </w:pPr>
-      <w:hyperlink w:anchor="_Toc308526334" w:history="1">
+      <w:hyperlink w:anchor="_Toc239431419" w:history="1">
         <w:r>
           <w:rPr>
             <w:rStyle w:val="Lienhypertexte"/>
             <w:noProof/>
           </w:rPr>
-          <w:t>3.2</w:t>
-        </w:r>
-        <w:r>
-          <w:rPr>
-            <w:rFonts w:eastAsiaTheme="minorEastAsia" w:cstheme="minorBidi"/>
-            <w:smallCaps w:val="0"/>
-            <w:noProof/>
-            <w:sz w:val="22"/>
-            <w:szCs w:val="22"/>
+          <w:t>Test</w:t>
+        </w:r>
+        <w:r>
+          <w:rPr>
+            <w:noProof/>
+            <w:webHidden/>
           </w:rPr>
           <w:tab/>
         </w:r>
         <w:r>
           <w:rPr>
-            <w:rStyle w:val="Lienhypertexte"/>
-            <w:noProof/>
-          </w:rPr>
-          <w:t>Document d’analyse et conception</w:t>
-        </w:r>
-        <w:r>
-          <w:rPr>
-            <w:noProof/>
-            <w:webHidden/>
-          </w:rPr>
-          <w:tab/>
-        </w:r>
-        <w:r>
-          <w:rPr>
             <w:noProof/>
             <w:webHidden/>
           </w:rPr>
@@ -1894,7 +918,7 @@
             <w:noProof/>
             <w:webHidden/>
           </w:rPr>
-          <w:instrText xml:space="preserve"> PAGEREF _Toc308526334 \h </w:instrText>
+          <w:instrText xml:space="preserve"> PAGEREF _Toc239431419 \h </w:instrText>
         </w:r>
         <w:r>
           <w:rPr>
@@ -1929,51 +953,35 @@
       <w:pPr>
         <w:pStyle w:val="TM2"/>
         <w:tabs>
-          <w:tab w:val="left" w:pos="800"/>
           <w:tab w:val="right" w:leader="dot" w:pos="9060"/>
         </w:tabs>
         <w:rPr>
           <w:rFonts w:eastAsiaTheme="minorEastAsia" w:cstheme="minorBidi"/>
           <w:smallCaps w:val="0"/>
           <w:noProof/>
-          <w:sz w:val="22"/>
-          <w:szCs w:val="22"/>
+          <w:kern w:val="2"/>
+          <w:sz w:val="24"/>
+          <w:szCs w:val="24"/>
+          <w14:ligatures w14:val="standardContextual"/>
         </w:rPr>
       </w:pPr>
-      <w:hyperlink w:anchor="_Toc308526335" w:history="1">
+      <w:hyperlink w:anchor="_Toc239431420" w:history="1">
         <w:r>
           <w:rPr>
             <w:rStyle w:val="Lienhypertexte"/>
             <w:noProof/>
           </w:rPr>
-          <w:t>3.3</w:t>
-        </w:r>
-        <w:r>
-          <w:rPr>
-            <w:rFonts w:eastAsiaTheme="minorEastAsia" w:cstheme="minorBidi"/>
-            <w:smallCaps w:val="0"/>
-            <w:noProof/>
-            <w:sz w:val="22"/>
-            <w:szCs w:val="22"/>
+          <w:t>#2 — US2 : Création des ennemis</w:t>
+        </w:r>
+        <w:r>
+          <w:rPr>
+            <w:noProof/>
+            <w:webHidden/>
           </w:rPr>
           <w:tab/>
         </w:r>
         <w:r>
           <w:rPr>
-            <w:rStyle w:val="Lienhypertexte"/>
-            <w:noProof/>
-          </w:rPr>
-          <w:t>Conception des tests</w:t>
-        </w:r>
-        <w:r>
-          <w:rPr>
-            <w:noProof/>
-            <w:webHidden/>
-          </w:rPr>
-          <w:tab/>
-        </w:r>
-        <w:r>
-          <w:rPr>
             <w:noProof/>
             <w:webHidden/>
           </w:rPr>
@@ -1984,7 +992,7 @@
             <w:noProof/>
             <w:webHidden/>
           </w:rPr>
-          <w:instrText xml:space="preserve"> PAGEREF _Toc308526335 \h </w:instrText>
+          <w:instrText xml:space="preserve"> PAGEREF _Toc239431420 \h </w:instrText>
         </w:r>
         <w:r>
           <w:rPr>
@@ -2004,7 +1012,7 @@
             <w:noProof/>
             <w:webHidden/>
           </w:rPr>
-          <w:t>5</w:t>
+          <w:t>4</w:t>
         </w:r>
         <w:r>
           <w:rPr>
@@ -2017,34 +1025,40 @@
     </w:p>
     <w:p>
       <w:pPr>
-        <w:pStyle w:val="TM2"/>
+        <w:pStyle w:val="TM3"/>
         <w:tabs>
-          <w:tab w:val="left" w:pos="800"/>
+          <w:tab w:val="left" w:pos="1200"/>
           <w:tab w:val="right" w:leader="dot" w:pos="9060"/>
         </w:tabs>
         <w:rPr>
           <w:rFonts w:eastAsiaTheme="minorEastAsia" w:cstheme="minorBidi"/>
-          <w:smallCaps w:val="0"/>
+          <w:i w:val="0"/>
+          <w:iCs w:val="0"/>
           <w:noProof/>
-          <w:sz w:val="22"/>
-          <w:szCs w:val="22"/>
+          <w:kern w:val="2"/>
+          <w:sz w:val="24"/>
+          <w:szCs w:val="24"/>
+          <w14:ligatures w14:val="standardContextual"/>
         </w:rPr>
       </w:pPr>
-      <w:hyperlink w:anchor="_Toc308526336" w:history="1">
+      <w:hyperlink w:anchor="_Toc239431421" w:history="1">
         <w:r>
           <w:rPr>
             <w:rStyle w:val="Lienhypertexte"/>
             <w:noProof/>
           </w:rPr>
-          <w:t>3.4</w:t>
+          <w:t>3.1.2</w:t>
         </w:r>
         <w:r>
           <w:rPr>
             <w:rFonts w:eastAsiaTheme="minorEastAsia" w:cstheme="minorBidi"/>
-            <w:smallCaps w:val="0"/>
-            <w:noProof/>
-            <w:sz w:val="22"/>
-            <w:szCs w:val="22"/>
+            <w:i w:val="0"/>
+            <w:iCs w:val="0"/>
+            <w:noProof/>
+            <w:kern w:val="2"/>
+            <w:sz w:val="24"/>
+            <w:szCs w:val="24"/>
+            <w14:ligatures w14:val="standardContextual"/>
           </w:rPr>
           <w:tab/>
         </w:r>
@@ -2053,7 +1067,7 @@
             <w:rStyle w:val="Lienhypertexte"/>
             <w:noProof/>
           </w:rPr>
-          <w:t>Planification détaillée</w:t>
+          <w:t>UserStory</w:t>
         </w:r>
         <w:r>
           <w:rPr>
@@ -2074,7 +1088,7 @@
             <w:noProof/>
             <w:webHidden/>
           </w:rPr>
-          <w:instrText xml:space="preserve"> PAGEREF _Toc308526336 \h </w:instrText>
+          <w:instrText xml:space="preserve"> PAGEREF _Toc239431421 \h </w:instrText>
         </w:r>
         <w:r>
           <w:rPr>
@@ -2094,7 +1108,103 @@
             <w:noProof/>
             <w:webHidden/>
           </w:rPr>
-          <w:t>5</w:t>
+          <w:t>4</w:t>
+        </w:r>
+        <w:r>
+          <w:rPr>
+            <w:noProof/>
+            <w:webHidden/>
+          </w:rPr>
+          <w:fldChar w:fldCharType="end"/>
+        </w:r>
+      </w:hyperlink>
+    </w:p>
+    <w:p>
+      <w:pPr>
+        <w:pStyle w:val="TM3"/>
+        <w:tabs>
+          <w:tab w:val="left" w:pos="1200"/>
+          <w:tab w:val="right" w:leader="dot" w:pos="9060"/>
+        </w:tabs>
+        <w:rPr>
+          <w:rFonts w:eastAsiaTheme="minorEastAsia" w:cstheme="minorBidi"/>
+          <w:i w:val="0"/>
+          <w:iCs w:val="0"/>
+          <w:noProof/>
+          <w:kern w:val="2"/>
+          <w:sz w:val="24"/>
+          <w:szCs w:val="24"/>
+          <w14:ligatures w14:val="standardContextual"/>
+        </w:rPr>
+      </w:pPr>
+      <w:hyperlink w:anchor="_Toc239431422" w:history="1">
+        <w:r>
+          <w:rPr>
+            <w:rStyle w:val="Lienhypertexte"/>
+            <w:noProof/>
+          </w:rPr>
+          <w:t>3.1.3</w:t>
+        </w:r>
+        <w:r>
+          <w:rPr>
+            <w:rFonts w:eastAsiaTheme="minorEastAsia" w:cstheme="minorBidi"/>
+            <w:i w:val="0"/>
+            <w:iCs w:val="0"/>
+            <w:noProof/>
+            <w:kern w:val="2"/>
+            <w:sz w:val="24"/>
+            <w:szCs w:val="24"/>
+            <w14:ligatures w14:val="standardContextual"/>
+          </w:rPr>
+          <w:tab/>
+        </w:r>
+        <w:r>
+          <w:rPr>
+            <w:rStyle w:val="Lienhypertexte"/>
+            <w:noProof/>
+          </w:rPr>
+          <w:t>Test</w:t>
+        </w:r>
+        <w:r>
+          <w:rPr>
+            <w:noProof/>
+            <w:webHidden/>
+          </w:rPr>
+          <w:tab/>
+        </w:r>
+        <w:r>
+          <w:rPr>
+            <w:noProof/>
+            <w:webHidden/>
+          </w:rPr>
+          <w:fldChar w:fldCharType="begin"/>
+        </w:r>
+        <w:r>
+          <w:rPr>
+            <w:noProof/>
+            <w:webHidden/>
+          </w:rPr>
+          <w:instrText xml:space="preserve"> PAGEREF _Toc239431422 \h </w:instrText>
+        </w:r>
+        <w:r>
+          <w:rPr>
+            <w:noProof/>
+            <w:webHidden/>
+          </w:rPr>
+        </w:r>
+        <w:r>
+          <w:rPr>
+            <w:noProof/>
+            <w:webHidden/>
+          </w:rPr>
+          <w:fldChar w:fldCharType="separate"/>
+        </w:r>
+        <w:r>
+          <w:rPr>
+            <w:noProof/>
+            <w:webHidden/>
+          </w:rPr>
+          <w:t>4</w:t>
         </w:r>
         <w:r>
           <w:rPr>
@@ -2109,7 +1219,7 @@
       <w:pPr>
         <w:pStyle w:val="TM10"/>
         <w:tabs>
-          <w:tab w:val="left" w:pos="400"/>
+          <w:tab w:val="left" w:pos="600"/>
           <w:tab w:val="right" w:leader="dot" w:pos="9060"/>
         </w:tabs>
         <w:rPr>
@@ -2118,17 +1228,19 @@
           <w:bCs w:val="0"/>
           <w:caps w:val="0"/>
           <w:noProof/>
-          <w:sz w:val="22"/>
-          <w:szCs w:val="22"/>
+          <w:kern w:val="2"/>
+          <w:sz w:val="24"/>
+          <w:szCs w:val="24"/>
+          <w14:ligatures w14:val="standardContextual"/>
         </w:rPr>
       </w:pPr>
-      <w:hyperlink w:anchor="_Toc308526337" w:history="1">
+      <w:hyperlink w:anchor="_Toc239431423" w:history="1">
         <w:r>
           <w:rPr>
             <w:rStyle w:val="Lienhypertexte"/>
             <w:noProof/>
           </w:rPr>
-          <w:t>4</w:t>
+          <w:t>3.2</w:t>
         </w:r>
         <w:r>
           <w:rPr>
@@ -2137,8 +1249,10 @@
             <w:bCs w:val="0"/>
             <w:caps w:val="0"/>
             <w:noProof/>
-            <w:sz w:val="22"/>
-            <w:szCs w:val="22"/>
+            <w:kern w:val="2"/>
+            <w:sz w:val="24"/>
+            <w:szCs w:val="24"/>
+            <w14:ligatures w14:val="standardContextual"/>
           </w:rPr>
           <w:tab/>
         </w:r>
@@ -2147,7 +1261,7 @@
             <w:rStyle w:val="Lienhypertexte"/>
             <w:noProof/>
           </w:rPr>
-          <w:t>Réalisation</w:t>
+          <w:t>#3 — US3: Tirer</w:t>
         </w:r>
         <w:r>
           <w:rPr>
@@ -2168,7 +1282,7 @@
             <w:noProof/>
             <w:webHidden/>
           </w:rPr>
-          <w:instrText xml:space="preserve"> PAGEREF _Toc308526337 \h </w:instrText>
+          <w:instrText xml:space="preserve"> PAGEREF _Toc239431423 \h </w:instrText>
         </w:r>
         <w:r>
           <w:rPr>
@@ -2203,51 +1317,35 @@
       <w:pPr>
         <w:pStyle w:val="TM2"/>
         <w:tabs>
-          <w:tab w:val="left" w:pos="800"/>
           <w:tab w:val="right" w:leader="dot" w:pos="9060"/>
         </w:tabs>
         <w:rPr>
           <w:rFonts w:eastAsiaTheme="minorEastAsia" w:cstheme="minorBidi"/>
           <w:smallCaps w:val="0"/>
           <w:noProof/>
-          <w:sz w:val="22"/>
-          <w:szCs w:val="22"/>
+          <w:kern w:val="2"/>
+          <w:sz w:val="24"/>
+          <w:szCs w:val="24"/>
+          <w14:ligatures w14:val="standardContextual"/>
         </w:rPr>
       </w:pPr>
-      <w:hyperlink w:anchor="_Toc308526338" w:history="1">
+      <w:hyperlink w:anchor="_Toc239431424" w:history="1">
         <w:r>
           <w:rPr>
             <w:rStyle w:val="Lienhypertexte"/>
             <w:noProof/>
           </w:rPr>
-          <w:t>4.1</w:t>
-        </w:r>
-        <w:r>
-          <w:rPr>
-            <w:rFonts w:eastAsiaTheme="minorEastAsia" w:cstheme="minorBidi"/>
-            <w:smallCaps w:val="0"/>
-            <w:noProof/>
-            <w:sz w:val="22"/>
-            <w:szCs w:val="22"/>
+          <w:t>UserStory</w:t>
+        </w:r>
+        <w:r>
+          <w:rPr>
+            <w:noProof/>
+            <w:webHidden/>
           </w:rPr>
           <w:tab/>
         </w:r>
         <w:r>
           <w:rPr>
-            <w:rStyle w:val="Lienhypertexte"/>
-            <w:noProof/>
-          </w:rPr>
-          <w:t>Dossier de Réalisation</w:t>
-        </w:r>
-        <w:r>
-          <w:rPr>
-            <w:noProof/>
-            <w:webHidden/>
-          </w:rPr>
-          <w:tab/>
-        </w:r>
-        <w:r>
-          <w:rPr>
             <w:noProof/>
             <w:webHidden/>
           </w:rPr>
@@ -2258,7 +1356,7 @@
             <w:noProof/>
             <w:webHidden/>
           </w:rPr>
-          <w:instrText xml:space="preserve"> PAGEREF _Toc308526338 \h </w:instrText>
+          <w:instrText xml:space="preserve"> PAGEREF _Toc239431424 \h </w:instrText>
         </w:r>
         <w:r>
           <w:rPr>
@@ -2293,51 +1391,35 @@
       <w:pPr>
         <w:pStyle w:val="TM2"/>
         <w:tabs>
-          <w:tab w:val="left" w:pos="800"/>
           <w:tab w:val="right" w:leader="dot" w:pos="9060"/>
         </w:tabs>
         <w:rPr>
           <w:rFonts w:eastAsiaTheme="minorEastAsia" w:cstheme="minorBidi"/>
           <w:smallCaps w:val="0"/>
           <w:noProof/>
-          <w:sz w:val="22"/>
-          <w:szCs w:val="22"/>
+          <w:kern w:val="2"/>
+          <w:sz w:val="24"/>
+          <w:szCs w:val="24"/>
+          <w14:ligatures w14:val="standardContextual"/>
         </w:rPr>
       </w:pPr>
-      <w:hyperlink w:anchor="_Toc308526339" w:history="1">
+      <w:hyperlink w:anchor="_Toc239431425" w:history="1">
         <w:r>
           <w:rPr>
             <w:rStyle w:val="Lienhypertexte"/>
             <w:noProof/>
           </w:rPr>
-          <w:t>4.2</w:t>
-        </w:r>
-        <w:r>
-          <w:rPr>
-            <w:rFonts w:eastAsiaTheme="minorEastAsia" w:cstheme="minorBidi"/>
-            <w:smallCaps w:val="0"/>
-            <w:noProof/>
-            <w:sz w:val="22"/>
-            <w:szCs w:val="22"/>
+          <w:t>Test</w:t>
+        </w:r>
+        <w:r>
+          <w:rPr>
+            <w:noProof/>
+            <w:webHidden/>
           </w:rPr>
           <w:tab/>
         </w:r>
         <w:r>
           <w:rPr>
-            <w:rStyle w:val="Lienhypertexte"/>
-            <w:noProof/>
-          </w:rPr>
-          <w:t>Modifications</w:t>
-        </w:r>
-        <w:r>
-          <w:rPr>
-            <w:noProof/>
-            <w:webHidden/>
-          </w:rPr>
-          <w:tab/>
-        </w:r>
-        <w:r>
-          <w:rPr>
             <w:noProof/>
             <w:webHidden/>
           </w:rPr>
@@ -2348,7 +1430,7 @@
             <w:noProof/>
             <w:webHidden/>
           </w:rPr>
-          <w:instrText xml:space="preserve"> PAGEREF _Toc308526339 \h </w:instrText>
+          <w:instrText xml:space="preserve"> PAGEREF _Toc239431425 \h </w:instrText>
         </w:r>
         <w:r>
           <w:rPr>
@@ -2383,7 +1465,7 @@
       <w:pPr>
         <w:pStyle w:val="TM10"/>
         <w:tabs>
-          <w:tab w:val="left" w:pos="400"/>
+          <w:tab w:val="left" w:pos="600"/>
           <w:tab w:val="right" w:leader="dot" w:pos="9060"/>
         </w:tabs>
         <w:rPr>
@@ -2392,17 +1474,19 @@
           <w:bCs w:val="0"/>
           <w:caps w:val="0"/>
           <w:noProof/>
-          <w:sz w:val="22"/>
-          <w:szCs w:val="22"/>
+          <w:kern w:val="2"/>
+          <w:sz w:val="24"/>
+          <w:szCs w:val="24"/>
+          <w14:ligatures w14:val="standardContextual"/>
         </w:rPr>
       </w:pPr>
-      <w:hyperlink w:anchor="_Toc308526340" w:history="1">
+      <w:hyperlink w:anchor="_Toc239431426" w:history="1">
         <w:r>
           <w:rPr>
             <w:rStyle w:val="Lienhypertexte"/>
             <w:noProof/>
           </w:rPr>
-          <w:t>5</w:t>
+          <w:t>3.3</w:t>
         </w:r>
         <w:r>
           <w:rPr>
@@ -2411,8 +1495,10 @@
             <w:bCs w:val="0"/>
             <w:caps w:val="0"/>
             <w:noProof/>
-            <w:sz w:val="22"/>
-            <w:szCs w:val="22"/>
+            <w:kern w:val="2"/>
+            <w:sz w:val="24"/>
+            <w:szCs w:val="24"/>
+            <w14:ligatures w14:val="standardContextual"/>
           </w:rPr>
           <w:tab/>
         </w:r>
@@ -2421,7 +1507,7 @@
             <w:rStyle w:val="Lienhypertexte"/>
             <w:noProof/>
           </w:rPr>
-          <w:t>Tests</w:t>
+          <w:t>#4 — US4: Protection</w:t>
         </w:r>
         <w:r>
           <w:rPr>
@@ -2442,7 +1528,7 @@
             <w:noProof/>
             <w:webHidden/>
           </w:rPr>
-          <w:instrText xml:space="preserve"> PAGEREF _Toc308526340 \h </w:instrText>
+          <w:instrText xml:space="preserve"> PAGEREF _Toc239431426 \h </w:instrText>
         </w:r>
         <w:r>
           <w:rPr>
@@ -2462,7 +1548,7 @@
             <w:noProof/>
             <w:webHidden/>
           </w:rPr>
-          <w:t>5</w:t>
+          <w:t>6</w:t>
         </w:r>
         <w:r>
           <w:rPr>
@@ -2477,41 +1563,99 @@
       <w:pPr>
         <w:pStyle w:val="TM2"/>
         <w:tabs>
-          <w:tab w:val="left" w:pos="800"/>
           <w:tab w:val="right" w:leader="dot" w:pos="9060"/>
         </w:tabs>
         <w:rPr>
           <w:rFonts w:eastAsiaTheme="minorEastAsia" w:cstheme="minorBidi"/>
           <w:smallCaps w:val="0"/>
           <w:noProof/>
-          <w:sz w:val="22"/>
-          <w:szCs w:val="22"/>
+          <w:kern w:val="2"/>
+          <w:sz w:val="24"/>
+          <w:szCs w:val="24"/>
+          <w14:ligatures w14:val="standardContextual"/>
         </w:rPr>
       </w:pPr>
-      <w:hyperlink w:anchor="_Toc308526341" w:history="1">
+      <w:hyperlink w:anchor="_Toc239431427" w:history="1">
         <w:r>
           <w:rPr>
             <w:rStyle w:val="Lienhypertexte"/>
             <w:noProof/>
           </w:rPr>
-          <w:t>5.1</w:t>
-        </w:r>
-        <w:r>
-          <w:rPr>
-            <w:rFonts w:eastAsiaTheme="minorEastAsia" w:cstheme="minorBidi"/>
-            <w:smallCaps w:val="0"/>
-            <w:noProof/>
-            <w:sz w:val="22"/>
-            <w:szCs w:val="22"/>
+          <w:t>UserStory</w:t>
+        </w:r>
+        <w:r>
+          <w:rPr>
+            <w:noProof/>
+            <w:webHidden/>
           </w:rPr>
           <w:tab/>
         </w:r>
         <w:r>
           <w:rPr>
+            <w:noProof/>
+            <w:webHidden/>
+          </w:rPr>
+          <w:fldChar w:fldCharType="begin"/>
+        </w:r>
+        <w:r>
+          <w:rPr>
+            <w:noProof/>
+            <w:webHidden/>
+          </w:rPr>
+          <w:instrText xml:space="preserve"> PAGEREF _Toc239431427 \h </w:instrText>
+        </w:r>
+        <w:r>
+          <w:rPr>
+            <w:noProof/>
+            <w:webHidden/>
+          </w:rPr>
+        </w:r>
+        <w:r>
+          <w:rPr>
+            <w:noProof/>
+            <w:webHidden/>
+          </w:rPr>
+          <w:fldChar w:fldCharType="separate"/>
+        </w:r>
+        <w:r>
+          <w:rPr>
+            <w:noProof/>
+            <w:webHidden/>
+          </w:rPr>
+          <w:t>6</w:t>
+        </w:r>
+        <w:r>
+          <w:rPr>
+            <w:noProof/>
+            <w:webHidden/>
+          </w:rPr>
+          <w:fldChar w:fldCharType="end"/>
+        </w:r>
+      </w:hyperlink>
+    </w:p>
+    <w:p>
+      <w:pPr>
+        <w:pStyle w:val="TM2"/>
+        <w:tabs>
+          <w:tab w:val="right" w:leader="dot" w:pos="9060"/>
+        </w:tabs>
+        <w:rPr>
+          <w:rFonts w:eastAsiaTheme="minorEastAsia" w:cstheme="minorBidi"/>
+          <w:smallCaps w:val="0"/>
+          <w:noProof/>
+          <w:kern w:val="2"/>
+          <w:sz w:val="24"/>
+          <w:szCs w:val="24"/>
+          <w14:ligatures w14:val="standardContextual"/>
+        </w:rPr>
+      </w:pPr>
+      <w:hyperlink w:anchor="_Toc239431428" w:history="1">
+        <w:r>
+          <w:rPr>
             <w:rStyle w:val="Lienhypertexte"/>
             <w:noProof/>
           </w:rPr>
-          <w:t>Dossier des tests</w:t>
+          <w:t>Test</w:t>
         </w:r>
         <w:r>
           <w:rPr>
@@ -2532,7 +1676,7 @@
             <w:noProof/>
             <w:webHidden/>
           </w:rPr>
-          <w:instrText xml:space="preserve"> PAGEREF _Toc308526341 \h </w:instrText>
+          <w:instrText xml:space="preserve"> PAGEREF _Toc239431428 \h </w:instrText>
         </w:r>
         <w:r>
           <w:rPr>
@@ -2552,7 +1696,7 @@
             <w:noProof/>
             <w:webHidden/>
           </w:rPr>
-          <w:t>5</w:t>
+          <w:t>6</w:t>
         </w:r>
         <w:r>
           <w:rPr>
@@ -2567,7 +1711,7 @@
       <w:pPr>
         <w:pStyle w:val="TM10"/>
         <w:tabs>
-          <w:tab w:val="left" w:pos="400"/>
+          <w:tab w:val="left" w:pos="600"/>
           <w:tab w:val="right" w:leader="dot" w:pos="9060"/>
         </w:tabs>
         <w:rPr>
@@ -2576,17 +1720,19 @@
           <w:bCs w:val="0"/>
           <w:caps w:val="0"/>
           <w:noProof/>
-          <w:sz w:val="22"/>
-          <w:szCs w:val="22"/>
+          <w:kern w:val="2"/>
+          <w:sz w:val="24"/>
+          <w:szCs w:val="24"/>
+          <w14:ligatures w14:val="standardContextual"/>
         </w:rPr>
       </w:pPr>
-      <w:hyperlink w:anchor="_Toc308526342" w:history="1">
+      <w:hyperlink w:anchor="_Toc239431429" w:history="1">
         <w:r>
           <w:rPr>
             <w:rStyle w:val="Lienhypertexte"/>
             <w:noProof/>
           </w:rPr>
-          <w:t>6</w:t>
+          <w:t>3.4</w:t>
         </w:r>
         <w:r>
           <w:rPr>
@@ -2595,8 +1741,10 @@
             <w:bCs w:val="0"/>
             <w:caps w:val="0"/>
             <w:noProof/>
-            <w:sz w:val="22"/>
-            <w:szCs w:val="22"/>
+            <w:kern w:val="2"/>
+            <w:sz w:val="24"/>
+            <w:szCs w:val="24"/>
+            <w14:ligatures w14:val="standardContextual"/>
           </w:rPr>
           <w:tab/>
         </w:r>
@@ -2605,7 +1753,7 @@
             <w:rStyle w:val="Lienhypertexte"/>
             <w:noProof/>
           </w:rPr>
-          <w:t>Conclusion</w:t>
+          <w:t>#5 — US5: Vie du joueur</w:t>
         </w:r>
         <w:r>
           <w:rPr>
@@ -2626,7 +1774,7 @@
             <w:noProof/>
             <w:webHidden/>
           </w:rPr>
-          <w:instrText xml:space="preserve"> PAGEREF _Toc308526342 \h </w:instrText>
+          <w:instrText xml:space="preserve"> PAGEREF _Toc239431429 \h </w:instrText>
         </w:r>
         <w:r>
           <w:rPr>
@@ -2646,7 +1794,7 @@
             <w:noProof/>
             <w:webHidden/>
           </w:rPr>
-          <w:t>5</w:t>
+          <w:t>7</w:t>
         </w:r>
         <w:r>
           <w:rPr>
@@ -2661,51 +1809,35 @@
       <w:pPr>
         <w:pStyle w:val="TM2"/>
         <w:tabs>
-          <w:tab w:val="left" w:pos="800"/>
           <w:tab w:val="right" w:leader="dot" w:pos="9060"/>
         </w:tabs>
         <w:rPr>
           <w:rFonts w:eastAsiaTheme="minorEastAsia" w:cstheme="minorBidi"/>
           <w:smallCaps w:val="0"/>
           <w:noProof/>
-          <w:sz w:val="22"/>
-          <w:szCs w:val="22"/>
+          <w:kern w:val="2"/>
+          <w:sz w:val="24"/>
+          <w:szCs w:val="24"/>
+          <w14:ligatures w14:val="standardContextual"/>
         </w:rPr>
       </w:pPr>
-      <w:hyperlink w:anchor="_Toc308526343" w:history="1">
+      <w:hyperlink w:anchor="_Toc239431430" w:history="1">
         <w:r>
           <w:rPr>
             <w:rStyle w:val="Lienhypertexte"/>
             <w:noProof/>
           </w:rPr>
-          <w:t>6.1</w:t>
-        </w:r>
-        <w:r>
-          <w:rPr>
-            <w:rFonts w:eastAsiaTheme="minorEastAsia" w:cstheme="minorBidi"/>
-            <w:smallCaps w:val="0"/>
-            <w:noProof/>
-            <w:sz w:val="22"/>
-            <w:szCs w:val="22"/>
+          <w:t>UserStory</w:t>
+        </w:r>
+        <w:r>
+          <w:rPr>
+            <w:noProof/>
+            <w:webHidden/>
           </w:rPr>
           <w:tab/>
         </w:r>
         <w:r>
           <w:rPr>
-            <w:rStyle w:val="Lienhypertexte"/>
-            <w:noProof/>
-          </w:rPr>
-          <w:t>Bilan des fonctionnalités demandées</w:t>
-        </w:r>
-        <w:r>
-          <w:rPr>
-            <w:noProof/>
-            <w:webHidden/>
-          </w:rPr>
-          <w:tab/>
-        </w:r>
-        <w:r>
-          <w:rPr>
             <w:noProof/>
             <w:webHidden/>
           </w:rPr>
@@ -2716,7 +1848,7 @@
             <w:noProof/>
             <w:webHidden/>
           </w:rPr>
-          <w:instrText xml:space="preserve"> PAGEREF _Toc308526343 \h </w:instrText>
+          <w:instrText xml:space="preserve"> PAGEREF _Toc239431430 \h </w:instrText>
         </w:r>
         <w:r>
           <w:rPr>
@@ -2736,7 +1868,7 @@
             <w:noProof/>
             <w:webHidden/>
           </w:rPr>
-          <w:t>5</w:t>
+          <w:t>7</w:t>
         </w:r>
         <w:r>
           <w:rPr>
@@ -2751,51 +1883,35 @@
       <w:pPr>
         <w:pStyle w:val="TM2"/>
         <w:tabs>
-          <w:tab w:val="left" w:pos="800"/>
           <w:tab w:val="right" w:leader="dot" w:pos="9060"/>
         </w:tabs>
         <w:rPr>
           <w:rFonts w:eastAsiaTheme="minorEastAsia" w:cstheme="minorBidi"/>
           <w:smallCaps w:val="0"/>
           <w:noProof/>
-          <w:sz w:val="22"/>
-          <w:szCs w:val="22"/>
+          <w:kern w:val="2"/>
+          <w:sz w:val="24"/>
+          <w:szCs w:val="24"/>
+          <w14:ligatures w14:val="standardContextual"/>
         </w:rPr>
       </w:pPr>
-      <w:hyperlink w:anchor="_Toc308526344" w:history="1">
+      <w:hyperlink w:anchor="_Toc239431431" w:history="1">
         <w:r>
           <w:rPr>
             <w:rStyle w:val="Lienhypertexte"/>
             <w:noProof/>
           </w:rPr>
-          <w:t>6.2</w:t>
-        </w:r>
-        <w:r>
-          <w:rPr>
-            <w:rFonts w:eastAsiaTheme="minorEastAsia" w:cstheme="minorBidi"/>
-            <w:smallCaps w:val="0"/>
-            <w:noProof/>
-            <w:sz w:val="22"/>
-            <w:szCs w:val="22"/>
+          <w:t>Test</w:t>
+        </w:r>
+        <w:r>
+          <w:rPr>
+            <w:noProof/>
+            <w:webHidden/>
           </w:rPr>
           <w:tab/>
         </w:r>
         <w:r>
           <w:rPr>
-            <w:rStyle w:val="Lienhypertexte"/>
-            <w:noProof/>
-          </w:rPr>
-          <w:t>Bilan de la planification</w:t>
-        </w:r>
-        <w:r>
-          <w:rPr>
-            <w:noProof/>
-            <w:webHidden/>
-          </w:rPr>
-          <w:tab/>
-        </w:r>
-        <w:r>
-          <w:rPr>
             <w:noProof/>
             <w:webHidden/>
           </w:rPr>
@@ -2806,7 +1922,7 @@
             <w:noProof/>
             <w:webHidden/>
           </w:rPr>
-          <w:instrText xml:space="preserve"> PAGEREF _Toc308526344 \h </w:instrText>
+          <w:instrText xml:space="preserve"> PAGEREF _Toc239431431 \h </w:instrText>
         </w:r>
         <w:r>
           <w:rPr>
@@ -2826,97 +1942,7 @@
             <w:noProof/>
             <w:webHidden/>
           </w:rPr>
-          <w:t>5</w:t>
-        </w:r>
-        <w:r>
-          <w:rPr>
-            <w:noProof/>
-            <w:webHidden/>
-          </w:rPr>
-          <w:fldChar w:fldCharType="end"/>
-        </w:r>
-      </w:hyperlink>
-    </w:p>
-    <w:p>
-      <w:pPr>
-        <w:pStyle w:val="TM2"/>
-        <w:tabs>
-          <w:tab w:val="left" w:pos="800"/>
-          <w:tab w:val="right" w:leader="dot" w:pos="9060"/>
-        </w:tabs>
-        <w:rPr>
-          <w:rFonts w:eastAsiaTheme="minorEastAsia" w:cstheme="minorBidi"/>
-          <w:smallCaps w:val="0"/>
-          <w:noProof/>
-          <w:sz w:val="22"/>
-          <w:szCs w:val="22"/>
-        </w:rPr>
-      </w:pPr>
-      <w:hyperlink w:anchor="_Toc308526345" w:history="1">
-        <w:r>
-          <w:rPr>
-            <w:rStyle w:val="Lienhypertexte"/>
-            <w:noProof/>
-          </w:rPr>
-          <w:t>6.3</w:t>
-        </w:r>
-        <w:r>
-          <w:rPr>
-            <w:rFonts w:eastAsiaTheme="minorEastAsia" w:cstheme="minorBidi"/>
-            <w:smallCaps w:val="0"/>
-            <w:noProof/>
-            <w:sz w:val="22"/>
-            <w:szCs w:val="22"/>
-          </w:rPr>
-          <w:tab/>
-        </w:r>
-        <w:r>
-          <w:rPr>
-            <w:rStyle w:val="Lienhypertexte"/>
-            <w:noProof/>
-          </w:rPr>
-          <w:t>Bilan personnel</w:t>
-        </w:r>
-        <w:r>
-          <w:rPr>
-            <w:noProof/>
-            <w:webHidden/>
-          </w:rPr>
-          <w:tab/>
-        </w:r>
-        <w:r>
-          <w:rPr>
-            <w:noProof/>
-            <w:webHidden/>
-          </w:rPr>
-          <w:fldChar w:fldCharType="begin"/>
-        </w:r>
-        <w:r>
-          <w:rPr>
-            <w:noProof/>
-            <w:webHidden/>
-          </w:rPr>
-          <w:instrText xml:space="preserve"> PAGEREF _Toc308526345 \h </w:instrText>
-        </w:r>
-        <w:r>
-          <w:rPr>
-            <w:noProof/>
-            <w:webHidden/>
-          </w:rPr>
-        </w:r>
-        <w:r>
-          <w:rPr>
-            <w:noProof/>
-            <w:webHidden/>
-          </w:rPr>
-          <w:fldChar w:fldCharType="separate"/>
-        </w:r>
-        <w:r>
-          <w:rPr>
-            <w:noProof/>
-            <w:webHidden/>
-          </w:rPr>
-          <w:t>5</w:t>
+          <w:t>7</w:t>
         </w:r>
         <w:r>
           <w:rPr>
@@ -2931,7 +1957,7 @@
       <w:pPr>
         <w:pStyle w:val="TM10"/>
         <w:tabs>
-          <w:tab w:val="left" w:pos="400"/>
+          <w:tab w:val="left" w:pos="600"/>
           <w:tab w:val="right" w:leader="dot" w:pos="9060"/>
         </w:tabs>
         <w:rPr>
@@ -2940,17 +1966,19 @@
           <w:bCs w:val="0"/>
           <w:caps w:val="0"/>
           <w:noProof/>
-          <w:sz w:val="22"/>
-          <w:szCs w:val="22"/>
+          <w:kern w:val="2"/>
+          <w:sz w:val="24"/>
+          <w:szCs w:val="24"/>
+          <w14:ligatures w14:val="standardContextual"/>
         </w:rPr>
       </w:pPr>
-      <w:hyperlink w:anchor="_Toc308526346" w:history="1">
+      <w:hyperlink w:anchor="_Toc239431432" w:history="1">
         <w:r>
           <w:rPr>
             <w:rStyle w:val="Lienhypertexte"/>
             <w:noProof/>
           </w:rPr>
-          <w:t>7</w:t>
+          <w:t>3.5</w:t>
         </w:r>
         <w:r>
           <w:rPr>
@@ -2959,8 +1987,10 @@
             <w:bCs w:val="0"/>
             <w:caps w:val="0"/>
             <w:noProof/>
-            <w:sz w:val="22"/>
-            <w:szCs w:val="22"/>
+            <w:kern w:val="2"/>
+            <w:sz w:val="24"/>
+            <w:szCs w:val="24"/>
+            <w14:ligatures w14:val="standardContextual"/>
           </w:rPr>
           <w:tab/>
         </w:r>
@@ -2969,7 +1999,7 @@
             <w:rStyle w:val="Lienhypertexte"/>
             <w:noProof/>
           </w:rPr>
-          <w:t>Divers</w:t>
+          <w:t>#6 — US6: bonus si le temps le permet ajout d'une deuxième attaque</w:t>
         </w:r>
         <w:r>
           <w:rPr>
@@ -2990,7 +2020,7 @@
             <w:noProof/>
             <w:webHidden/>
           </w:rPr>
-          <w:instrText xml:space="preserve"> PAGEREF _Toc308526346 \h </w:instrText>
+          <w:instrText xml:space="preserve"> PAGEREF _Toc239431432 \h </w:instrText>
         </w:r>
         <w:r>
           <w:rPr>
@@ -3010,7 +2040,7 @@
             <w:noProof/>
             <w:webHidden/>
           </w:rPr>
-          <w:t>6</w:t>
+          <w:t>8</w:t>
         </w:r>
         <w:r>
           <w:rPr>
@@ -3025,51 +2055,35 @@
       <w:pPr>
         <w:pStyle w:val="TM2"/>
         <w:tabs>
-          <w:tab w:val="left" w:pos="800"/>
           <w:tab w:val="right" w:leader="dot" w:pos="9060"/>
         </w:tabs>
         <w:rPr>
           <w:rFonts w:eastAsiaTheme="minorEastAsia" w:cstheme="minorBidi"/>
           <w:smallCaps w:val="0"/>
           <w:noProof/>
-          <w:sz w:val="22"/>
-          <w:szCs w:val="22"/>
+          <w:kern w:val="2"/>
+          <w:sz w:val="24"/>
+          <w:szCs w:val="24"/>
+          <w14:ligatures w14:val="standardContextual"/>
         </w:rPr>
       </w:pPr>
-      <w:hyperlink w:anchor="_Toc308526347" w:history="1">
+      <w:hyperlink w:anchor="_Toc239431433" w:history="1">
         <w:r>
           <w:rPr>
             <w:rStyle w:val="Lienhypertexte"/>
             <w:noProof/>
           </w:rPr>
-          <w:t>7.1</w:t>
-        </w:r>
-        <w:r>
-          <w:rPr>
-            <w:rFonts w:eastAsiaTheme="minorEastAsia" w:cstheme="minorBidi"/>
-            <w:smallCaps w:val="0"/>
-            <w:noProof/>
-            <w:sz w:val="22"/>
-            <w:szCs w:val="22"/>
+          <w:t>UserStory</w:t>
+        </w:r>
+        <w:r>
+          <w:rPr>
+            <w:noProof/>
+            <w:webHidden/>
           </w:rPr>
           <w:tab/>
         </w:r>
         <w:r>
           <w:rPr>
-            <w:rStyle w:val="Lienhypertexte"/>
-            <w:noProof/>
-          </w:rPr>
-          <w:t>Journal de travail</w:t>
-        </w:r>
-        <w:r>
-          <w:rPr>
-            <w:noProof/>
-            <w:webHidden/>
-          </w:rPr>
-          <w:tab/>
-        </w:r>
-        <w:r>
-          <w:rPr>
             <w:noProof/>
             <w:webHidden/>
           </w:rPr>
@@ -3080,7 +2094,7 @@
             <w:noProof/>
             <w:webHidden/>
           </w:rPr>
-          <w:instrText xml:space="preserve"> PAGEREF _Toc308526347 \h </w:instrText>
+          <w:instrText xml:space="preserve"> PAGEREF _Toc239431433 \h </w:instrText>
         </w:r>
         <w:r>
           <w:rPr>
@@ -3100,7 +2114,7 @@
             <w:noProof/>
             <w:webHidden/>
           </w:rPr>
-          <w:t>6</w:t>
+          <w:t>8</w:t>
         </w:r>
         <w:r>
           <w:rPr>
@@ -3115,51 +2129,35 @@
       <w:pPr>
         <w:pStyle w:val="TM2"/>
         <w:tabs>
-          <w:tab w:val="left" w:pos="800"/>
           <w:tab w:val="right" w:leader="dot" w:pos="9060"/>
         </w:tabs>
         <w:rPr>
           <w:rFonts w:eastAsiaTheme="minorEastAsia" w:cstheme="minorBidi"/>
           <w:smallCaps w:val="0"/>
           <w:noProof/>
-          <w:sz w:val="22"/>
-          <w:szCs w:val="22"/>
+          <w:kern w:val="2"/>
+          <w:sz w:val="24"/>
+          <w:szCs w:val="24"/>
+          <w14:ligatures w14:val="standardContextual"/>
         </w:rPr>
       </w:pPr>
-      <w:hyperlink w:anchor="_Toc308526348" w:history="1">
+      <w:hyperlink w:anchor="_Toc239431434" w:history="1">
         <w:r>
           <w:rPr>
             <w:rStyle w:val="Lienhypertexte"/>
             <w:noProof/>
           </w:rPr>
-          <w:t>7.2</w:t>
-        </w:r>
-        <w:r>
-          <w:rPr>
-            <w:rFonts w:eastAsiaTheme="minorEastAsia" w:cstheme="minorBidi"/>
-            <w:smallCaps w:val="0"/>
-            <w:noProof/>
-            <w:sz w:val="22"/>
-            <w:szCs w:val="22"/>
+          <w:t>Test</w:t>
+        </w:r>
+        <w:r>
+          <w:rPr>
+            <w:noProof/>
+            <w:webHidden/>
           </w:rPr>
           <w:tab/>
         </w:r>
         <w:r>
           <w:rPr>
-            <w:rStyle w:val="Lienhypertexte"/>
-            <w:noProof/>
-          </w:rPr>
-          <w:t>Bibliographie</w:t>
-        </w:r>
-        <w:r>
-          <w:rPr>
-            <w:noProof/>
-            <w:webHidden/>
-          </w:rPr>
-          <w:tab/>
-        </w:r>
-        <w:r>
-          <w:rPr>
             <w:noProof/>
             <w:webHidden/>
           </w:rPr>
@@ -3170,7 +2168,7 @@
             <w:noProof/>
             <w:webHidden/>
           </w:rPr>
-          <w:instrText xml:space="preserve"> PAGEREF _Toc308526348 \h </w:instrText>
+          <w:instrText xml:space="preserve"> PAGEREF _Toc239431434 \h </w:instrText>
         </w:r>
         <w:r>
           <w:rPr>
@@ -3190,191 +2188,7 @@
             <w:noProof/>
             <w:webHidden/>
           </w:rPr>
-          <w:t>6</w:t>
-        </w:r>
-        <w:r>
-          <w:rPr>
-            <w:noProof/>
-            <w:webHidden/>
-          </w:rPr>
-          <w:fldChar w:fldCharType="end"/>
-        </w:r>
-      </w:hyperlink>
-    </w:p>
-    <w:p>
-      <w:pPr>
-        <w:pStyle w:val="TM2"/>
-        <w:tabs>
-          <w:tab w:val="left" w:pos="800"/>
-          <w:tab w:val="right" w:leader="dot" w:pos="9060"/>
-        </w:tabs>
-        <w:rPr>
-          <w:rFonts w:eastAsiaTheme="minorEastAsia" w:cstheme="minorBidi"/>
-          <w:smallCaps w:val="0"/>
-          <w:noProof/>
-          <w:sz w:val="22"/>
-          <w:szCs w:val="22"/>
-        </w:rPr>
-      </w:pPr>
-      <w:hyperlink w:anchor="_Toc308526349" w:history="1">
-        <w:r>
-          <w:rPr>
-            <w:rStyle w:val="Lienhypertexte"/>
-            <w:noProof/>
-          </w:rPr>
-          <w:t>7.3</w:t>
-        </w:r>
-        <w:r>
-          <w:rPr>
-            <w:rFonts w:eastAsiaTheme="minorEastAsia" w:cstheme="minorBidi"/>
-            <w:smallCaps w:val="0"/>
-            <w:noProof/>
-            <w:sz w:val="22"/>
-            <w:szCs w:val="22"/>
-          </w:rPr>
-          <w:tab/>
-        </w:r>
-        <w:r>
-          <w:rPr>
-            <w:rStyle w:val="Lienhypertexte"/>
-            <w:noProof/>
-          </w:rPr>
-          <w:t>Webographie</w:t>
-        </w:r>
-        <w:r>
-          <w:rPr>
-            <w:noProof/>
-            <w:webHidden/>
-          </w:rPr>
-          <w:tab/>
-        </w:r>
-        <w:r>
-          <w:rPr>
-            <w:noProof/>
-            <w:webHidden/>
-          </w:rPr>
-          <w:fldChar w:fldCharType="begin"/>
-        </w:r>
-        <w:r>
-          <w:rPr>
-            <w:noProof/>
-            <w:webHidden/>
-          </w:rPr>
-          <w:instrText xml:space="preserve"> PAGEREF _Toc308526349 \h </w:instrText>
-        </w:r>
-        <w:r>
-          <w:rPr>
-            <w:noProof/>
-            <w:webHidden/>
-          </w:rPr>
-        </w:r>
-        <w:r>
-          <w:rPr>
-            <w:noProof/>
-            <w:webHidden/>
-          </w:rPr>
-          <w:fldChar w:fldCharType="separate"/>
-        </w:r>
-        <w:r>
-          <w:rPr>
-            <w:noProof/>
-            <w:webHidden/>
-          </w:rPr>
-          <w:t>6</w:t>
-        </w:r>
-        <w:r>
-          <w:rPr>
-            <w:noProof/>
-            <w:webHidden/>
-          </w:rPr>
-          <w:fldChar w:fldCharType="end"/>
-        </w:r>
-      </w:hyperlink>
-    </w:p>
-    <w:p>
-      <w:pPr>
-        <w:pStyle w:val="TM10"/>
-        <w:tabs>
-          <w:tab w:val="left" w:pos="400"/>
-          <w:tab w:val="right" w:leader="dot" w:pos="9060"/>
-        </w:tabs>
-        <w:rPr>
-          <w:rFonts w:eastAsiaTheme="minorEastAsia" w:cstheme="minorBidi"/>
-          <w:b w:val="0"/>
-          <w:bCs w:val="0"/>
-          <w:caps w:val="0"/>
-          <w:noProof/>
-          <w:sz w:val="22"/>
-          <w:szCs w:val="22"/>
-        </w:rPr>
-      </w:pPr>
-      <w:hyperlink w:anchor="_Toc308526350" w:history="1">
-        <w:r>
-          <w:rPr>
-            <w:rStyle w:val="Lienhypertexte"/>
-            <w:noProof/>
-          </w:rPr>
           <w:t>8</w:t>
-        </w:r>
-        <w:r>
-          <w:rPr>
-            <w:rFonts w:eastAsiaTheme="minorEastAsia" w:cstheme="minorBidi"/>
-            <w:b w:val="0"/>
-            <w:bCs w:val="0"/>
-            <w:caps w:val="0"/>
-            <w:noProof/>
-            <w:sz w:val="22"/>
-            <w:szCs w:val="22"/>
-          </w:rPr>
-          <w:tab/>
-        </w:r>
-        <w:r>
-          <w:rPr>
-            <w:rStyle w:val="Lienhypertexte"/>
-            <w:noProof/>
-          </w:rPr>
-          <w:t>Annexes</w:t>
-        </w:r>
-        <w:r>
-          <w:rPr>
-            <w:noProof/>
-            <w:webHidden/>
-          </w:rPr>
-          <w:tab/>
-        </w:r>
-        <w:r>
-          <w:rPr>
-            <w:noProof/>
-            <w:webHidden/>
-          </w:rPr>
-          <w:fldChar w:fldCharType="begin"/>
-        </w:r>
-        <w:r>
-          <w:rPr>
-            <w:noProof/>
-            <w:webHidden/>
-          </w:rPr>
-          <w:instrText xml:space="preserve"> PAGEREF _Toc308526350 \h </w:instrText>
-        </w:r>
-        <w:r>
-          <w:rPr>
-            <w:noProof/>
-            <w:webHidden/>
-          </w:rPr>
-        </w:r>
-        <w:r>
-          <w:rPr>
-            <w:noProof/>
-            <w:webHidden/>
-          </w:rPr>
-          <w:fldChar w:fldCharType="separate"/>
-        </w:r>
-        <w:r>
-          <w:rPr>
-            <w:noProof/>
-            <w:webHidden/>
-          </w:rPr>
-          <w:t>6</w:t>
         </w:r>
         <w:r>
           <w:rPr>
@@ -3405,10 +2219,12 @@
       <w:pPr>
         <w:pStyle w:val="Titre1"/>
       </w:pPr>
+      <w:bookmarkStart w:id="0" w:name="_Toc239431411"/>
       <w:r>
         <w:lastRenderedPageBreak/>
         <w:t>Introduction</w:t>
       </w:r>
+      <w:bookmarkEnd w:id="0"/>
     </w:p>
     <w:p>
       <w:pPr>
@@ -3419,9 +2235,9 @@
       <w:pPr>
         <w:pStyle w:val="Titre2"/>
       </w:pPr>
-      <w:bookmarkStart w:id="0" w:name="_Toc308526317"/>
       <w:bookmarkStart w:id="1" w:name="_Toc532179969"/>
       <w:bookmarkStart w:id="2" w:name="_Toc165969639"/>
+      <w:bookmarkStart w:id="3" w:name="_Toc239431412"/>
       <w:r>
         <w:t>T</w:t>
       </w:r>
@@ -3431,7 +2247,7 @@
       <w:r>
         <w:t>e</w:t>
       </w:r>
-      <w:bookmarkEnd w:id="0"/>
+      <w:bookmarkEnd w:id="3"/>
     </w:p>
     <w:p>
       <w:pPr>
@@ -3458,9 +2274,11 @@
       <w:pPr>
         <w:pStyle w:val="Titre2"/>
       </w:pPr>
+      <w:bookmarkStart w:id="4" w:name="_Toc239431413"/>
       <w:r>
         <w:t>Objectifs produits</w:t>
       </w:r>
+      <w:bookmarkEnd w:id="4"/>
     </w:p>
     <w:p>
       <w:pPr>
@@ -3502,9 +2320,11 @@
       <w:pPr>
         <w:pStyle w:val="Titre2"/>
       </w:pPr>
+      <w:bookmarkStart w:id="5" w:name="_Toc239431414"/>
       <w:r>
         <w:t>Objectifs pédagogiques</w:t>
       </w:r>
+      <w:bookmarkEnd w:id="5"/>
     </w:p>
     <w:p>
       <w:pPr>
@@ -3539,7 +2359,7 @@
       <w:pPr>
         <w:pStyle w:val="Titre1"/>
       </w:pPr>
-      <w:bookmarkStart w:id="3" w:name="_Toc308526331"/>
+      <w:bookmarkStart w:id="6" w:name="_Toc239431415"/>
       <w:r>
         <w:t>Planification</w:t>
       </w:r>
@@ -3548,7 +2368,7 @@
       <w:r>
         <w:t xml:space="preserve"> Initiale</w:t>
       </w:r>
-      <w:bookmarkEnd w:id="3"/>
+      <w:bookmarkEnd w:id="6"/>
     </w:p>
     <w:tbl>
       <w:tblPr>
@@ -4045,148 +2865,106 @@
       <w:pPr>
         <w:pStyle w:val="Titre1"/>
       </w:pPr>
-      <w:bookmarkStart w:id="4" w:name="_Toc532179957"/>
-      <w:bookmarkStart w:id="5" w:name="_Toc165969641"/>
-      <w:bookmarkStart w:id="6" w:name="_Toc308526332"/>
+      <w:bookmarkStart w:id="7" w:name="_Toc532179957"/>
+      <w:bookmarkStart w:id="8" w:name="_Toc165969641"/>
+      <w:bookmarkStart w:id="9" w:name="_Toc239431416"/>
       <w:r>
         <w:t>Analyse</w:t>
       </w:r>
-      <w:bookmarkEnd w:id="4"/>
-      <w:bookmarkEnd w:id="5"/>
-      <w:bookmarkEnd w:id="6"/>
+      <w:bookmarkEnd w:id="7"/>
+      <w:bookmarkEnd w:id="8"/>
+      <w:bookmarkEnd w:id="9"/>
     </w:p>
     <w:p>
       <w:pPr>
         <w:pStyle w:val="Titre2"/>
       </w:pPr>
+      <w:bookmarkStart w:id="10" w:name="_Toc239431417"/>
       <w:r>
         <w:t>User story</w:t>
       </w:r>
-    </w:p>
-    <w:p>
-      <w:pPr>
-        <w:pStyle w:val="Titre"/>
-        <w:rPr>
-          <w:lang w:val="en-US"/>
-        </w:rPr>
-      </w:pPr>
-      <w:proofErr w:type="spellStart"/>
-      <w:r>
-        <w:rPr>
-          <w:lang w:val="en-US"/>
-        </w:rPr>
-        <w:t>EsteEscher</w:t>
-      </w:r>
-      <w:proofErr w:type="spellEnd"/>
-      <w:r>
-        <w:rPr>
-          <w:lang w:val="en-US"/>
-        </w:rPr>
-        <w:t>/</w:t>
-      </w:r>
-      <w:proofErr w:type="spellStart"/>
-      <w:r>
-        <w:rPr>
-          <w:lang w:val="en-US"/>
-        </w:rPr>
-        <w:t>Shoot_me_up</w:t>
-      </w:r>
-      <w:proofErr w:type="spellEnd"/>
-    </w:p>
-    <w:p>
-      <w:pPr>
-        <w:rPr>
-          <w:lang w:val="en-US"/>
-        </w:rPr>
-      </w:pPr>
-      <w:proofErr w:type="spellStart"/>
-      <w:r>
-        <w:rPr>
-          <w:i/>
-          <w:iCs/>
-          <w:lang w:val="en-US"/>
-        </w:rPr>
-        <w:t>Exporté</w:t>
-      </w:r>
-      <w:proofErr w:type="spellEnd"/>
-      <w:r>
-        <w:rPr>
-          <w:i/>
-          <w:iCs/>
-          <w:lang w:val="en-US"/>
-        </w:rPr>
-        <w:t xml:space="preserve"> le 04.09.2026 — 6 issues</w:t>
-      </w:r>
-    </w:p>
-    <w:p>
-      <w:r>
-        <w:rPr>
-          <w:i/>
-          <w:iCs/>
-        </w:rPr>
-        <w:t>Source : https://github.com/EsteEscher/Shoot_me_up</w:t>
-      </w:r>
-    </w:p>
-    <w:p/>
-    <w:p>
-      <w:pPr>
-        <w:pStyle w:val="Titre1"/>
-      </w:pPr>
+      <w:bookmarkEnd w:id="10"/>
+    </w:p>
+    <w:p>
+      <w:pPr>
+        <w:pStyle w:val="Titre3"/>
+      </w:pPr>
+      <w:bookmarkStart w:id="11" w:name="_Toc239431418"/>
+      <w:r>
+        <w:t>#1 — US</w:t>
+      </w:r>
+      <w:proofErr w:type="gramStart"/>
+      <w:r>
+        <w:t>1:</w:t>
+      </w:r>
+      <w:proofErr w:type="gramEnd"/>
+      <w:r>
+        <w:t xml:space="preserve"> Déplacement du joueur</w:t>
+      </w:r>
+      <w:bookmarkEnd w:id="11"/>
+    </w:p>
+    <w:p>
+      <w:pPr>
+        <w:ind w:left="1416"/>
+      </w:pPr>
+      <w:r>
+        <w:t>En tant que Joueur je veux pouvoir appuyer sur les touches W A S D mais aussi les flèches directionnelles afin de pouvoir déplacer mon personnage sur l'écran.</w:t>
+      </w:r>
+    </w:p>
+    <w:p>
+      <w:pPr>
+        <w:ind w:left="1416"/>
+      </w:pPr>
+    </w:p>
+    <w:p>
+      <w:pPr>
+        <w:pStyle w:val="Titre2"/>
+      </w:pPr>
+      <w:bookmarkStart w:id="12" w:name="_Toc239431419"/>
       <w:r>
         <w:lastRenderedPageBreak/>
-        <w:t>#1 — US</w:t>
-      </w:r>
-      <w:proofErr w:type="gramStart"/>
-      <w:r>
-        <w:t>1:</w:t>
-      </w:r>
-      <w:proofErr w:type="gramEnd"/>
-      <w:r>
-        <w:t xml:space="preserve"> Déplacement du joueur</w:t>
-      </w:r>
-    </w:p>
-    <w:p>
-      <w:pPr>
-        <w:pStyle w:val="Titre2"/>
-      </w:pPr>
-      <w:proofErr w:type="spellStart"/>
-      <w:r>
-        <w:t>UserStory</w:t>
-      </w:r>
-      <w:proofErr w:type="spellEnd"/>
-    </w:p>
-    <w:p>
-      <w:r>
-        <w:t>En tant que Joueur je veux pouvoir appuyer sur les touches W A S D mais aussi les flèches directionnelles afin de pouvoir déplacer mon personnage sur l'écran.</w:t>
-      </w:r>
-    </w:p>
-    <w:p/>
-    <w:p>
-      <w:pPr>
-        <w:pStyle w:val="Titre2"/>
-      </w:pPr>
-      <w:r>
         <w:t>Test</w:t>
       </w:r>
-    </w:p>
-    <w:p>
+      <w:bookmarkEnd w:id="12"/>
+    </w:p>
+    <w:p>
+      <w:pPr>
+        <w:ind w:left="1416"/>
+      </w:pPr>
       <w:r>
         <w:t>- Il est possible de me déplacer</w:t>
       </w:r>
     </w:p>
     <w:p>
+      <w:pPr>
+        <w:ind w:left="1416"/>
+      </w:pPr>
       <w:r>
         <w:t>- Les touches sont les bonnes et sont réactives</w:t>
       </w:r>
     </w:p>
     <w:p>
+      <w:pPr>
+        <w:ind w:left="1416"/>
+      </w:pPr>
       <w:r>
         <w:t>- La vitesse de déplacement et agréable</w:t>
       </w:r>
     </w:p>
-    <w:p/>
-    <w:p/>
-    <w:p>
+    <w:p>
+      <w:pPr>
+        <w:ind w:left="1416"/>
+      </w:pPr>
+    </w:p>
+    <w:p>
+      <w:pPr>
+        <w:ind w:left="1416"/>
+      </w:pPr>
+    </w:p>
+    <w:p>
+      <w:pPr>
+        <w:ind w:left="1416"/>
+      </w:pPr>
       <w:r>
         <w:rPr>
           <w:noProof/>
@@ -4235,23 +3013,30 @@
     <w:p/>
     <w:p>
       <w:pPr>
-        <w:pStyle w:val="Titre1"/>
-      </w:pPr>
+        <w:pStyle w:val="Titre2"/>
+      </w:pPr>
+      <w:bookmarkStart w:id="13" w:name="_Toc239431420"/>
       <w:r>
         <w:t>#2 — US2 : Création des ennemis</w:t>
       </w:r>
-    </w:p>
-    <w:p>
-      <w:pPr>
-        <w:pStyle w:val="Titre2"/>
-      </w:pPr>
+      <w:bookmarkEnd w:id="13"/>
+    </w:p>
+    <w:p>
+      <w:pPr>
+        <w:pStyle w:val="Titre3"/>
+      </w:pPr>
+      <w:bookmarkStart w:id="14" w:name="_Toc239431421"/>
       <w:proofErr w:type="spellStart"/>
       <w:r>
         <w:t>UserStory</w:t>
       </w:r>
+      <w:bookmarkEnd w:id="14"/>
       <w:proofErr w:type="spellEnd"/>
     </w:p>
     <w:p>
+      <w:pPr>
+        <w:ind w:left="1416"/>
+      </w:pPr>
       <w:r>
         <w:t xml:space="preserve">En tant que joueur je veux avoir des ennemis qui tire et avancent afin d'avoir du </w:t>
       </w:r>
@@ -4267,18 +3052,26 @@
     <w:p/>
     <w:p>
       <w:pPr>
-        <w:pStyle w:val="Titre2"/>
-      </w:pPr>
+        <w:pStyle w:val="Titre3"/>
+      </w:pPr>
+      <w:bookmarkStart w:id="15" w:name="_Toc239431422"/>
       <w:r>
         <w:t>Test</w:t>
       </w:r>
-    </w:p>
-    <w:p>
+      <w:bookmarkEnd w:id="15"/>
+    </w:p>
+    <w:p>
+      <w:pPr>
+        <w:ind w:left="1416"/>
+      </w:pPr>
       <w:r>
         <w:t>- Les ennemis apparaissent</w:t>
       </w:r>
     </w:p>
     <w:p>
+      <w:pPr>
+        <w:ind w:left="1416"/>
+      </w:pPr>
       <w:r>
         <w:t xml:space="preserve">- les ennemis </w:t>
       </w:r>
@@ -4292,6 +3085,9 @@
       </w:r>
     </w:p>
     <w:p>
+      <w:pPr>
+        <w:ind w:left="1416"/>
+      </w:pPr>
       <w:r>
         <w:t>- les ennemis se déplacent</w:t>
       </w:r>
@@ -4349,7 +3145,12 @@
     <w:p>
       <w:pPr>
         <w:pStyle w:val="Titre1"/>
-      </w:pPr>
+        <w:numPr>
+          <w:ilvl w:val="1"/>
+          <w:numId w:val="13"/>
+        </w:numPr>
+      </w:pPr>
+      <w:bookmarkStart w:id="16" w:name="_Toc239431423"/>
       <w:r>
         <w:t>#3 — US</w:t>
       </w:r>
@@ -4361,37 +3162,55 @@
       <w:r>
         <w:t xml:space="preserve"> Tirer</w:t>
       </w:r>
+      <w:bookmarkEnd w:id="16"/>
     </w:p>
     <w:p>
       <w:pPr>
         <w:pStyle w:val="Titre2"/>
       </w:pPr>
+      <w:bookmarkStart w:id="17" w:name="_Toc239431424"/>
       <w:proofErr w:type="spellStart"/>
       <w:r>
         <w:t>UserStory</w:t>
       </w:r>
+      <w:bookmarkEnd w:id="17"/>
       <w:proofErr w:type="spellEnd"/>
     </w:p>
     <w:p>
+      <w:pPr>
+        <w:ind w:left="1416"/>
+      </w:pPr>
       <w:r>
         <w:t>En tant que joueur je veux pouvoir tirer afin de pouvoir me défendre</w:t>
       </w:r>
     </w:p>
-    <w:p/>
+    <w:p>
+      <w:pPr>
+        <w:ind w:left="1416"/>
+      </w:pPr>
+    </w:p>
     <w:p>
       <w:pPr>
         <w:pStyle w:val="Titre2"/>
       </w:pPr>
+      <w:bookmarkStart w:id="18" w:name="_Toc239431425"/>
       <w:r>
         <w:t>Test</w:t>
       </w:r>
-    </w:p>
-    <w:p>
+      <w:bookmarkEnd w:id="18"/>
+    </w:p>
+    <w:p>
+      <w:pPr>
+        <w:ind w:left="1416"/>
+      </w:pPr>
       <w:r>
         <w:t>- mes tirent ont une vitesse régulière</w:t>
       </w:r>
     </w:p>
     <w:p>
+      <w:pPr>
+        <w:ind w:left="1416"/>
+      </w:pPr>
       <w:r>
         <w:t xml:space="preserve">- mes tirs ont un </w:t>
       </w:r>
@@ -4405,6 +3224,9 @@
       </w:r>
     </w:p>
     <w:p>
+      <w:pPr>
+        <w:ind w:left="1416"/>
+      </w:pPr>
       <w:r>
         <w:t xml:space="preserve">- mes tirs suivent la direction </w:t>
       </w:r>
@@ -4470,7 +3292,12 @@
     <w:p>
       <w:pPr>
         <w:pStyle w:val="Titre1"/>
-      </w:pPr>
+        <w:numPr>
+          <w:ilvl w:val="1"/>
+          <w:numId w:val="13"/>
+        </w:numPr>
+      </w:pPr>
+      <w:bookmarkStart w:id="19" w:name="_Toc239431426"/>
       <w:r>
         <w:t>#4 — US</w:t>
       </w:r>
@@ -4482,18 +3309,24 @@
       <w:r>
         <w:t xml:space="preserve"> Protection</w:t>
       </w:r>
+      <w:bookmarkEnd w:id="19"/>
     </w:p>
     <w:p>
       <w:pPr>
         <w:pStyle w:val="Titre2"/>
       </w:pPr>
+      <w:bookmarkStart w:id="20" w:name="_Toc239431427"/>
       <w:proofErr w:type="spellStart"/>
       <w:r>
         <w:t>UserStory</w:t>
       </w:r>
+      <w:bookmarkEnd w:id="20"/>
       <w:proofErr w:type="spellEnd"/>
     </w:p>
     <w:p>
+      <w:pPr>
+        <w:ind w:left="2124"/>
+      </w:pPr>
       <w:r>
         <w:t xml:space="preserve">En tant que joueur je veux avoir des protections afin d'avoir une </w:t>
       </w:r>
@@ -4514,26 +3347,41 @@
         <w:t xml:space="preserve"> autre que de les esquiver</w:t>
       </w:r>
     </w:p>
-    <w:p/>
+    <w:p>
+      <w:pPr>
+        <w:ind w:left="1416"/>
+      </w:pPr>
+    </w:p>
     <w:p>
       <w:pPr>
         <w:pStyle w:val="Titre2"/>
       </w:pPr>
+      <w:bookmarkStart w:id="21" w:name="_Toc239431428"/>
       <w:r>
         <w:t>Test</w:t>
       </w:r>
-    </w:p>
-    <w:p>
+      <w:bookmarkEnd w:id="21"/>
+    </w:p>
+    <w:p>
+      <w:pPr>
+        <w:ind w:left="2124"/>
+      </w:pPr>
       <w:r>
         <w:t>- Les 5 protections sont complète au début de la partie</w:t>
       </w:r>
     </w:p>
     <w:p>
+      <w:pPr>
+        <w:ind w:left="2124"/>
+      </w:pPr>
       <w:r>
         <w:t>- le joueur et les ennemis peuvent détruire la barrière</w:t>
       </w:r>
     </w:p>
     <w:p>
+      <w:pPr>
+        <w:ind w:left="2124"/>
+      </w:pPr>
       <w:r>
         <w:t>- la barrière se régénère après un certain temps</w:t>
       </w:r>
@@ -4591,7 +3439,12 @@
     <w:p>
       <w:pPr>
         <w:pStyle w:val="Titre1"/>
-      </w:pPr>
+        <w:numPr>
+          <w:ilvl w:val="1"/>
+          <w:numId w:val="13"/>
+        </w:numPr>
+      </w:pPr>
+      <w:bookmarkStart w:id="22" w:name="_Toc239431429"/>
       <w:r>
         <w:t>#5 — US</w:t>
       </w:r>
@@ -4603,18 +3456,24 @@
       <w:r>
         <w:t xml:space="preserve"> Vie du joueur</w:t>
       </w:r>
+      <w:bookmarkEnd w:id="22"/>
     </w:p>
     <w:p>
       <w:pPr>
         <w:pStyle w:val="Titre2"/>
       </w:pPr>
+      <w:bookmarkStart w:id="23" w:name="_Toc239431430"/>
       <w:proofErr w:type="spellStart"/>
       <w:r>
         <w:t>UserStory</w:t>
       </w:r>
+      <w:bookmarkEnd w:id="23"/>
       <w:proofErr w:type="spellEnd"/>
     </w:p>
     <w:p>
+      <w:pPr>
+        <w:ind w:left="2124"/>
+      </w:pPr>
       <w:r>
         <w:t>En tant que joueur je veux avoir des points de vies afin de ne pas mourir à la première touche</w:t>
       </w:r>
@@ -4623,21 +3482,32 @@
       <w:pPr>
         <w:pStyle w:val="Titre2"/>
       </w:pPr>
+      <w:bookmarkStart w:id="24" w:name="_Toc239431431"/>
       <w:r>
         <w:t>Test</w:t>
       </w:r>
-    </w:p>
-    <w:p>
+      <w:bookmarkEnd w:id="24"/>
+    </w:p>
+    <w:p>
+      <w:pPr>
+        <w:ind w:left="2124"/>
+      </w:pPr>
       <w:r>
         <w:t>- Le joueur perd une vie après un contact avec un projectile ennemi</w:t>
       </w:r>
     </w:p>
     <w:p>
+      <w:pPr>
+        <w:ind w:left="2124"/>
+      </w:pPr>
       <w:r>
         <w:t>- Une vie est en vie après la consommation d'une vie</w:t>
       </w:r>
     </w:p>
     <w:p>
+      <w:pPr>
+        <w:ind w:left="2124"/>
+      </w:pPr>
       <w:r>
         <w:t>- les barrières se reconstruisent complètement à la perte d'une vie</w:t>
       </w:r>
@@ -4696,7 +3566,12 @@
     <w:p>
       <w:pPr>
         <w:pStyle w:val="Titre1"/>
-      </w:pPr>
+        <w:numPr>
+          <w:ilvl w:val="1"/>
+          <w:numId w:val="13"/>
+        </w:numPr>
+      </w:pPr>
+      <w:bookmarkStart w:id="25" w:name="_Toc239431432"/>
       <w:r>
         <w:t>#6 — US</w:t>
       </w:r>
@@ -4708,18 +3583,24 @@
       <w:r>
         <w:t xml:space="preserve"> bonus si le temps le permet ajout d'une deuxième attaque</w:t>
       </w:r>
+      <w:bookmarkEnd w:id="25"/>
     </w:p>
     <w:p>
       <w:pPr>
         <w:pStyle w:val="Titre2"/>
       </w:pPr>
+      <w:bookmarkStart w:id="26" w:name="_Toc239431433"/>
       <w:proofErr w:type="spellStart"/>
       <w:r>
         <w:t>UserStory</w:t>
       </w:r>
+      <w:bookmarkEnd w:id="26"/>
       <w:proofErr w:type="spellEnd"/>
     </w:p>
     <w:p>
+      <w:pPr>
+        <w:ind w:left="2124"/>
+      </w:pPr>
       <w:r>
         <w:t>En tant que joueur je veux avoir une deuxième attaque de masse permettant d'éliminer tous les ennemis sur l'écran d'un seul coup (</w:t>
       </w:r>
@@ -4732,26 +3613,41 @@
         <w:t>)</w:t>
       </w:r>
     </w:p>
-    <w:p/>
+    <w:p>
+      <w:pPr>
+        <w:ind w:left="2124"/>
+      </w:pPr>
+    </w:p>
     <w:p>
       <w:pPr>
         <w:pStyle w:val="Titre2"/>
       </w:pPr>
+      <w:bookmarkStart w:id="27" w:name="_Toc239431434"/>
       <w:r>
         <w:t>Test</w:t>
       </w:r>
-    </w:p>
-    <w:p>
+      <w:bookmarkEnd w:id="27"/>
+    </w:p>
+    <w:p>
+      <w:pPr>
+        <w:ind w:left="2124"/>
+      </w:pPr>
       <w:r>
         <w:t>- tous les ennemis sont éliminés d'un coup</w:t>
       </w:r>
     </w:p>
     <w:p>
+      <w:pPr>
+        <w:ind w:left="2124"/>
+      </w:pPr>
       <w:r>
         <w:t>- les barrières sont toutes intégralement</w:t>
       </w:r>
     </w:p>
     <w:p>
+      <w:pPr>
+        <w:ind w:left="2124"/>
+      </w:pPr>
       <w:r>
         <w:t xml:space="preserve">- le </w:t>
       </w:r>
@@ -4873,8 +3769,8 @@
       <w:tblLook w:val="01E0" w:firstRow="1" w:lastRow="1" w:firstColumn="1" w:lastColumn="1" w:noHBand="0" w:noVBand="0"/>
     </w:tblPr>
     <w:tblGrid>
-      <w:gridCol w:w="3437"/>
-      <w:gridCol w:w="2607"/>
+      <w:gridCol w:w="3436"/>
+      <w:gridCol w:w="2608"/>
       <w:gridCol w:w="3026"/>
     </w:tblGrid>
     <w:tr>
@@ -5034,6 +3930,15 @@
           </w:r>
           <w:r>
             <w:instrText xml:space="preserve"> LASTSAVEDBY   \* MERGEFORMAT </w:instrText>
+          </w:r>
+          <w:r>
+            <w:fldChar w:fldCharType="separate"/>
+          </w:r>
+          <w:r>
+            <w:rPr>
+              <w:noProof/>
+            </w:rPr>
+            <w:t>Esteban Escher</w:t>
           </w:r>
           <w:r>
             <w:rPr>
@@ -5213,7 +4118,7 @@
               <w:noProof/>
               <w:szCs w:val="16"/>
             </w:rPr>
-            <w:t>04.09.2009 15:21</w:t>
+            <w:t>04.09.2026 16:23</w:t>
           </w:r>
           <w:r>
             <w:rPr>
@@ -5256,7 +4161,7 @@
                 <w:noProof/>
                 <w:szCs w:val="16"/>
               </w:rPr>
-              <w:t>1</w:t>
+              <w:t>4</w:t>
             </w:r>
           </w:fldSimple>
           <w:r>
@@ -5293,7 +4198,7 @@
               <w:noProof/>
               <w:szCs w:val="16"/>
             </w:rPr>
-            <w:t>00.00.0000 00:00</w:t>
+            <w:t>04.09.2026 16:19</w:t>
           </w:r>
           <w:r>
             <w:rPr>
@@ -5317,18 +4222,45 @@
             <w:rPr>
               <w:rFonts w:cs="Arial"/>
               <w:szCs w:val="16"/>
+              <w:lang w:val="en-US"/>
             </w:rPr>
           </w:pPr>
-          <w:fldSimple w:instr=" FILENAME  \* FirstCap  \* MERGEFORMAT ">
-            <w:r>
-              <w:rPr>
-                <w:rFonts w:cs="Arial"/>
-                <w:noProof/>
-                <w:szCs w:val="16"/>
-              </w:rPr>
-              <w:t>Document1</w:t>
-            </w:r>
-          </w:fldSimple>
+          <w:r>
+            <w:fldChar w:fldCharType="begin"/>
+          </w:r>
+          <w:r>
+            <w:rPr>
+              <w:lang w:val="en-US"/>
+            </w:rPr>
+            <w:instrText xml:space="preserve"> FILENAME  \* FirstCap  \* MERGEFORMAT </w:instrText>
+          </w:r>
+          <w:r>
+            <w:fldChar w:fldCharType="separate"/>
+          </w:r>
+          <w:r>
+            <w:rPr>
+              <w:rFonts w:cs="Arial"/>
+              <w:noProof/>
+              <w:szCs w:val="16"/>
+              <w:lang w:val="en-US"/>
+            </w:rPr>
+            <w:t>Shoot-me-up-Rapport-EstebanEscher</w:t>
+          </w:r>
+          <w:r>
+            <w:rPr>
+              <w:noProof/>
+              <w:lang w:val="en-US"/>
+            </w:rPr>
+            <w:t>.docx</w:t>
+          </w:r>
+          <w:r>
+            <w:rPr>
+              <w:rFonts w:cs="Arial"/>
+              <w:noProof/>
+              <w:szCs w:val="16"/>
+            </w:rPr>
+            <w:fldChar w:fldCharType="end"/>
+          </w:r>
         </w:p>
       </w:tc>
     </w:tr>
@@ -5339,6 +4271,7 @@
       <w:rPr>
         <w:sz w:val="2"/>
         <w:szCs w:val="2"/>
+        <w:lang w:val="en-US"/>
       </w:rPr>
     </w:pPr>
   </w:p>
@@ -6818,7 +5751,6 @@
     <w:lvl w:ilvl="1">
       <w:start w:val="1"/>
       <w:numFmt w:val="decimal"/>
-      <w:pStyle w:val="Titre2"/>
       <w:lvlText w:val="%1.%2"/>
       <w:lvlJc w:val="left"/>
       <w:pPr>
@@ -9457,14 +8389,11 @@
     <w:next w:val="Retraitcorpsdetexte"/>
     <w:autoRedefine/>
     <w:qFormat/>
-    <w:rsid w:val="00AA4393"/>
+    <w:rsid w:val="00686F3D"/>
     <w:pPr>
       <w:keepNext/>
-      <w:numPr>
-        <w:ilvl w:val="1"/>
-        <w:numId w:val="13"/>
-      </w:numPr>
       <w:spacing w:before="120" w:after="60"/>
+      <w:ind w:left="1416"/>
       <w:outlineLvl w:val="1"/>
     </w:pPr>
     <w:rPr>
@@ -9813,7 +8742,6 @@
     <w:next w:val="Normal"/>
     <w:autoRedefine/>
     <w:uiPriority w:val="39"/>
-    <w:semiHidden/>
     <w:rsid w:val="00656974"/>
     <w:pPr>
       <w:spacing w:before="120" w:after="120"/>
@@ -9830,7 +8758,6 @@
     <w:next w:val="Normal"/>
     <w:autoRedefine/>
     <w:uiPriority w:val="39"/>
-    <w:semiHidden/>
     <w:rsid w:val="007F30AE"/>
     <w:pPr>
       <w:ind w:left="200"/>
@@ -9845,7 +8772,6 @@
     <w:next w:val="Normal"/>
     <w:autoRedefine/>
     <w:uiPriority w:val="39"/>
-    <w:semiHidden/>
     <w:rsid w:val="007F30AE"/>
     <w:pPr>
       <w:ind w:left="400"/>

</xml_diff>

<commit_message>
chore(code) commentaire fait avec l'ia
</commit_message>
<xml_diff>
--- a/doc/Shoot-me-up-Rapport-EstebanEscher.docx
+++ b/doc/Shoot-me-up-Rapport-EstebanEscher.docx
@@ -181,7 +181,7 @@
       <w:hyperlink w:anchor="_Toc244269416" w:history="1">
         <w:r>
           <w:rPr>
-            <w:rStyle w:val="Lienhypertexte"/>
+            <w:rStyle w:val="Hyperlien"/>
             <w:noProof/>
           </w:rPr>
           <w:t>1.</w:t>
@@ -200,7 +200,7 @@
         </w:r>
         <w:r>
           <w:rPr>
-            <w:rStyle w:val="Lienhypertexte"/>
+            <w:rStyle w:val="Hyperlien"/>
             <w:noProof/>
           </w:rPr>
           <w:t>Introduction</w:t>
@@ -276,7 +276,7 @@
       <w:hyperlink w:anchor="_Toc244269417" w:history="1">
         <w:r>
           <w:rPr>
-            <w:rStyle w:val="Lienhypertexte"/>
+            <w:rStyle w:val="Hyperlien"/>
             <w:noProof/>
           </w:rPr>
           <w:t>1.1.1</w:t>
@@ -296,7 +296,7 @@
         </w:r>
         <w:r>
           <w:rPr>
-            <w:rStyle w:val="Lienhypertexte"/>
+            <w:rStyle w:val="Hyperlien"/>
             <w:noProof/>
           </w:rPr>
           <w:t>Titre</w:t>
@@ -372,7 +372,7 @@
       <w:hyperlink w:anchor="_Toc244269418" w:history="1">
         <w:r>
           <w:rPr>
-            <w:rStyle w:val="Lienhypertexte"/>
+            <w:rStyle w:val="Hyperlien"/>
             <w:noProof/>
           </w:rPr>
           <w:t>1.1.2</w:t>
@@ -392,7 +392,7 @@
         </w:r>
         <w:r>
           <w:rPr>
-            <w:rStyle w:val="Lienhypertexte"/>
+            <w:rStyle w:val="Hyperlien"/>
             <w:noProof/>
           </w:rPr>
           <w:t>Objectifs produits</w:t>
@@ -468,7 +468,7 @@
       <w:hyperlink w:anchor="_Toc244269419" w:history="1">
         <w:r>
           <w:rPr>
-            <w:rStyle w:val="Lienhypertexte"/>
+            <w:rStyle w:val="Hyperlien"/>
             <w:noProof/>
           </w:rPr>
           <w:t>1.1.3</w:t>
@@ -488,7 +488,7 @@
         </w:r>
         <w:r>
           <w:rPr>
-            <w:rStyle w:val="Lienhypertexte"/>
+            <w:rStyle w:val="Hyperlien"/>
             <w:noProof/>
           </w:rPr>
           <w:t>Objectifs pédagogiques</w:t>
@@ -563,7 +563,7 @@
       <w:hyperlink w:anchor="_Toc244269420" w:history="1">
         <w:r>
           <w:rPr>
-            <w:rStyle w:val="Lienhypertexte"/>
+            <w:rStyle w:val="Hyperlien"/>
             <w:noProof/>
           </w:rPr>
           <w:t>2.</w:t>
@@ -582,7 +582,7 @@
         </w:r>
         <w:r>
           <w:rPr>
-            <w:rStyle w:val="Lienhypertexte"/>
+            <w:rStyle w:val="Hyperlien"/>
             <w:noProof/>
           </w:rPr>
           <w:t>Analyse</w:t>
@@ -658,7 +658,7 @@
       <w:hyperlink w:anchor="_Toc244269421" w:history="1">
         <w:r>
           <w:rPr>
-            <w:rStyle w:val="Lienhypertexte"/>
+            <w:rStyle w:val="Hyperlien"/>
             <w:noProof/>
           </w:rPr>
           <w:t>1.1.4</w:t>
@@ -678,7 +678,7 @@
         </w:r>
         <w:r>
           <w:rPr>
-            <w:rStyle w:val="Lienhypertexte"/>
+            <w:rStyle w:val="Hyperlien"/>
             <w:noProof/>
           </w:rPr>
           <w:t>#1 — US1: Déplacement du joueur</w:t>
@@ -754,7 +754,7 @@
       <w:hyperlink w:anchor="_Toc244269422" w:history="1">
         <w:r>
           <w:rPr>
-            <w:rStyle w:val="Lienhypertexte"/>
+            <w:rStyle w:val="Hyperlien"/>
             <w:noProof/>
           </w:rPr>
           <w:t>1.1.5</w:t>
@@ -774,7 +774,7 @@
         </w:r>
         <w:r>
           <w:rPr>
-            <w:rStyle w:val="Lienhypertexte"/>
+            <w:rStyle w:val="Hyperlien"/>
             <w:noProof/>
           </w:rPr>
           <w:t>#2 — US2 : Création des ennemis</w:t>
@@ -850,7 +850,7 @@
       <w:hyperlink w:anchor="_Toc244269423" w:history="1">
         <w:r>
           <w:rPr>
-            <w:rStyle w:val="Lienhypertexte"/>
+            <w:rStyle w:val="Hyperlien"/>
             <w:noProof/>
           </w:rPr>
           <w:t>1.1.6</w:t>
@@ -870,7 +870,7 @@
         </w:r>
         <w:r>
           <w:rPr>
-            <w:rStyle w:val="Lienhypertexte"/>
+            <w:rStyle w:val="Hyperlien"/>
             <w:noProof/>
           </w:rPr>
           <w:t>#3 — US3: Tirer</w:t>
@@ -946,7 +946,7 @@
       <w:hyperlink w:anchor="_Toc244269424" w:history="1">
         <w:r>
           <w:rPr>
-            <w:rStyle w:val="Lienhypertexte"/>
+            <w:rStyle w:val="Hyperlien"/>
             <w:noProof/>
           </w:rPr>
           <w:t>1.1.7</w:t>
@@ -966,7 +966,7 @@
         </w:r>
         <w:r>
           <w:rPr>
-            <w:rStyle w:val="Lienhypertexte"/>
+            <w:rStyle w:val="Hyperlien"/>
             <w:noProof/>
           </w:rPr>
           <w:t>#4 — US4: Protection</w:t>
@@ -1042,7 +1042,7 @@
       <w:hyperlink w:anchor="_Toc244269425" w:history="1">
         <w:r>
           <w:rPr>
-            <w:rStyle w:val="Lienhypertexte"/>
+            <w:rStyle w:val="Hyperlien"/>
             <w:noProof/>
           </w:rPr>
           <w:t>1.1.8</w:t>
@@ -1062,7 +1062,7 @@
         </w:r>
         <w:r>
           <w:rPr>
-            <w:rStyle w:val="Lienhypertexte"/>
+            <w:rStyle w:val="Hyperlien"/>
             <w:noProof/>
           </w:rPr>
           <w:t>#5 — US5: Vie du joueur</w:t>
@@ -1138,7 +1138,7 @@
       <w:hyperlink w:anchor="_Toc244269426" w:history="1">
         <w:r>
           <w:rPr>
-            <w:rStyle w:val="Lienhypertexte"/>
+            <w:rStyle w:val="Hyperlien"/>
             <w:noProof/>
           </w:rPr>
           <w:t>1.1.9</w:t>
@@ -1158,7 +1158,7 @@
         </w:r>
         <w:r>
           <w:rPr>
-            <w:rStyle w:val="Lienhypertexte"/>
+            <w:rStyle w:val="Hyperlien"/>
             <w:noProof/>
           </w:rPr>
           <w:t>#6 — US6: bonus si le temps le permet ajout d'une deuxième attaque</w:t>
@@ -1233,7 +1233,7 @@
       <w:hyperlink w:anchor="_Toc244269427" w:history="1">
         <w:r>
           <w:rPr>
-            <w:rStyle w:val="Lienhypertexte"/>
+            <w:rStyle w:val="Hyperlien"/>
             <w:noProof/>
           </w:rPr>
           <w:t>3.</w:t>
@@ -1252,7 +1252,7 @@
         </w:r>
         <w:r>
           <w:rPr>
-            <w:rStyle w:val="Lienhypertexte"/>
+            <w:rStyle w:val="Hyperlien"/>
             <w:noProof/>
           </w:rPr>
           <w:t>RAPPORT DE TESTS</w:t>
@@ -1328,7 +1328,7 @@
       <w:hyperlink w:anchor="_Toc244269428" w:history="1">
         <w:r>
           <w:rPr>
-            <w:rStyle w:val="Lienhypertexte"/>
+            <w:rStyle w:val="Hyperlien"/>
             <w:noProof/>
           </w:rPr>
           <w:t>1.1.10</w:t>
@@ -1348,7 +1348,7 @@
         </w:r>
         <w:r>
           <w:rPr>
-            <w:rStyle w:val="Lienhypertexte"/>
+            <w:rStyle w:val="Hyperlien"/>
             <w:noProof/>
           </w:rPr>
           <w:t>Suite de tests unitaires  (MSTest)</w:t>
@@ -1423,7 +1423,7 @@
       <w:hyperlink w:anchor="_Toc244269429" w:history="1">
         <w:r>
           <w:rPr>
-            <w:rStyle w:val="Lienhypertexte"/>
+            <w:rStyle w:val="Hyperlien"/>
             <w:noProof/>
           </w:rPr>
           <w:t>4.</w:t>
@@ -1442,7 +1442,7 @@
         </w:r>
         <w:r>
           <w:rPr>
-            <w:rStyle w:val="Lienhypertexte"/>
+            <w:rStyle w:val="Hyperlien"/>
             <w:noProof/>
           </w:rPr>
           <w:t>Conception</w:t>
@@ -1518,7 +1518,7 @@
       <w:hyperlink w:anchor="_Toc244269430" w:history="1">
         <w:r>
           <w:rPr>
-            <w:rStyle w:val="Lienhypertexte"/>
+            <w:rStyle w:val="Hyperlien"/>
             <w:noProof/>
           </w:rPr>
           <w:t>1.1.11</w:t>
@@ -1538,7 +1538,7 @@
         </w:r>
         <w:r>
           <w:rPr>
-            <w:rStyle w:val="Lienhypertexte"/>
+            <w:rStyle w:val="Hyperlien"/>
             <w:noProof/>
           </w:rPr>
           <w:t>Avant le codage</w:t>
@@ -1614,7 +1614,7 @@
       <w:hyperlink w:anchor="_Toc244269431" w:history="1">
         <w:r>
           <w:rPr>
-            <w:rStyle w:val="Lienhypertexte"/>
+            <w:rStyle w:val="Hyperlien"/>
             <w:noProof/>
           </w:rPr>
           <w:t>1.1.12</w:t>
@@ -1634,7 +1634,7 @@
         </w:r>
         <w:r>
           <w:rPr>
-            <w:rStyle w:val="Lienhypertexte"/>
+            <w:rStyle w:val="Hyperlien"/>
             <w:noProof/>
           </w:rPr>
           <w:t>Pendant le codage</w:t>
@@ -1710,7 +1710,7 @@
       <w:hyperlink w:anchor="_Toc244269432" w:history="1">
         <w:r>
           <w:rPr>
-            <w:rStyle w:val="Lienhypertexte"/>
+            <w:rStyle w:val="Hyperlien"/>
             <w:noProof/>
           </w:rPr>
           <w:t>1.1.13</w:t>
@@ -1730,7 +1730,7 @@
         </w:r>
         <w:r>
           <w:rPr>
-            <w:rStyle w:val="Lienhypertexte"/>
+            <w:rStyle w:val="Hyperlien"/>
             <w:noProof/>
           </w:rPr>
           <w:t>Diagrame de classe</w:t>
@@ -1805,7 +1805,7 @@
       <w:hyperlink w:anchor="_Toc244269433" w:history="1">
         <w:r>
           <w:rPr>
-            <w:rStyle w:val="Lienhypertexte"/>
+            <w:rStyle w:val="Hyperlien"/>
             <w:noProof/>
           </w:rPr>
           <w:t>5.</w:t>
@@ -1824,7 +1824,7 @@
         </w:r>
         <w:r>
           <w:rPr>
-            <w:rStyle w:val="Lienhypertexte"/>
+            <w:rStyle w:val="Hyperlien"/>
             <w:noProof/>
           </w:rPr>
           <w:t>Explication de utilisation de l’ia dans ce projet</w:t>
@@ -1868,7 +1868,7 @@
             <w:noProof/>
             <w:webHidden/>
           </w:rPr>
-          <w:t>10</w:t>
+          <w:t>11</w:t>
         </w:r>
         <w:r>
           <w:rPr>
@@ -1899,7 +1899,7 @@
       <w:hyperlink w:anchor="_Toc244269434" w:history="1">
         <w:r>
           <w:rPr>
-            <w:rStyle w:val="Lienhypertexte"/>
+            <w:rStyle w:val="Hyperlien"/>
             <w:noProof/>
           </w:rPr>
           <w:t>6.</w:t>
@@ -1918,7 +1918,7 @@
         </w:r>
         <w:r>
           <w:rPr>
-            <w:rStyle w:val="Lienhypertexte"/>
+            <w:rStyle w:val="Hyperlien"/>
             <w:noProof/>
           </w:rPr>
           <w:t>Bilan du déroulement du projet</w:t>
@@ -1962,7 +1962,7 @@
             <w:noProof/>
             <w:webHidden/>
           </w:rPr>
-          <w:t>10</w:t>
+          <w:t>12</w:t>
         </w:r>
         <w:r>
           <w:rPr>
@@ -1993,7 +1993,7 @@
       <w:hyperlink w:anchor="_Toc244269435" w:history="1">
         <w:r>
           <w:rPr>
-            <w:rStyle w:val="Lienhypertexte"/>
+            <w:rStyle w:val="Hyperlien"/>
             <w:noProof/>
           </w:rPr>
           <w:t>7.</w:t>
@@ -2012,7 +2012,7 @@
         </w:r>
         <w:r>
           <w:rPr>
-            <w:rStyle w:val="Lienhypertexte"/>
+            <w:rStyle w:val="Hyperlien"/>
             <w:noProof/>
           </w:rPr>
           <w:t>Bilan Produit</w:t>
@@ -2056,7 +2056,7 @@
             <w:noProof/>
             <w:webHidden/>
           </w:rPr>
-          <w:t>10</w:t>
+          <w:t>12</w:t>
         </w:r>
         <w:r>
           <w:rPr>
@@ -2087,7 +2087,7 @@
       <w:hyperlink w:anchor="_Toc244269436" w:history="1">
         <w:r>
           <w:rPr>
-            <w:rStyle w:val="Lienhypertexte"/>
+            <w:rStyle w:val="Hyperlien"/>
             <w:noProof/>
           </w:rPr>
           <w:t>8.</w:t>
@@ -2106,7 +2106,7 @@
         </w:r>
         <w:r>
           <w:rPr>
-            <w:rStyle w:val="Lienhypertexte"/>
+            <w:rStyle w:val="Hyperlien"/>
             <w:noProof/>
           </w:rPr>
           <w:t>Conclusion</w:t>
@@ -2150,7 +2150,7 @@
             <w:noProof/>
             <w:webHidden/>
           </w:rPr>
-          <w:t>11</w:t>
+          <w:t>12</w:t>
         </w:r>
         <w:r>
           <w:rPr>
@@ -2196,9 +2196,9 @@
         <w:pStyle w:val="Titre3"/>
         <w:ind w:left="709"/>
       </w:pPr>
-      <w:bookmarkStart w:id="1" w:name="_Toc532179969"/>
-      <w:bookmarkStart w:id="2" w:name="_Toc165969639"/>
-      <w:bookmarkStart w:id="3" w:name="_Toc244269417"/>
+      <w:bookmarkStart w:id="1" w:name="_Toc244269417"/>
+      <w:bookmarkStart w:id="2" w:name="_Toc532179969"/>
+      <w:bookmarkStart w:id="3" w:name="_Toc165969639"/>
       <w:r>
         <w:t>T</w:t>
       </w:r>
@@ -2208,7 +2208,7 @@
       <w:r>
         <w:t>e</w:t>
       </w:r>
-      <w:bookmarkEnd w:id="3"/>
+      <w:bookmarkEnd w:id="1"/>
     </w:p>
     <w:p>
       <w:pPr>
@@ -2356,8 +2356,8 @@
         <w:ind w:left="709"/>
       </w:pPr>
     </w:p>
-    <w:bookmarkEnd w:id="1"/>
     <w:bookmarkEnd w:id="2"/>
+    <w:bookmarkEnd w:id="3"/>
     <w:p>
       <w:pPr>
         <w:ind w:left="709"/>
@@ -3533,10 +3533,7 @@
         <w:ind w:left="709"/>
       </w:pPr>
       <w:r>
-        <w:t>Les</w:t>
-      </w:r>
-      <w:r>
-        <w:t xml:space="preserve"> 5 protections Kinto sont complètes et réparties au début de la partie.</w:t>
+        <w:t>Les 5 protections Kinto sont complètes et réparties au début de la partie.</w:t>
       </w:r>
     </w:p>
     <w:p>
@@ -4287,20 +4284,16 @@
         <w:t xml:space="preserve">     </w:t>
       </w:r>
       <w:bookmarkStart w:id="20" w:name="_Toc244269432"/>
-      <w:proofErr w:type="spellStart"/>
-      <w:r>
-        <w:t>Diagrame</w:t>
-      </w:r>
-      <w:proofErr w:type="spellEnd"/>
-      <w:r>
-        <w:t xml:space="preserve"> de classe</w:t>
+      <w:r>
+        <w:t>Diagra</w:t>
+      </w:r>
+      <w:r>
+        <w:t>m</w:t>
+      </w:r>
+      <w:r>
+        <w:t>me de classe</w:t>
       </w:r>
       <w:bookmarkEnd w:id="20"/>
-    </w:p>
-    <w:p>
-      <w:pPr>
-        <w:pStyle w:val="Retraitcorpsdetexte3"/>
-      </w:pPr>
     </w:p>
     <w:p>
       <w:pPr>
@@ -4362,57 +4355,692 @@
     </w:p>
     <w:p>
       <w:pPr>
+        <w:pStyle w:val="Retraitcorpsdetexte3"/>
+        <w:ind w:left="709"/>
+      </w:pPr>
+      <w:proofErr w:type="spellStart"/>
+      <w:r>
+        <w:rPr>
+          <w:b/>
+          <w:bCs/>
+        </w:rPr>
+        <w:t>GameSpace</w:t>
+      </w:r>
+      <w:proofErr w:type="spellEnd"/>
+      <w:r>
+        <w:rPr>
+          <w:b/>
+          <w:bCs/>
+        </w:rPr>
+        <w:t xml:space="preserve"> (Moteur central et affichage) :</w:t>
+      </w:r>
+      <w:r>
+        <w:t xml:space="preserve"> Héritant de </w:t>
+      </w:r>
+      <w:proofErr w:type="spellStart"/>
+      <w:r>
+        <w:t>Form</w:t>
+      </w:r>
+      <w:proofErr w:type="spellEnd"/>
+      <w:r>
+        <w:t xml:space="preserve"> (Windows Forms), cette classe constitue le contrôleur principal. Elle orchestre la boucle de rendu et d'actualisation (Update, Render) via un contexte graphique à double mise en mémoire </w:t>
+      </w:r>
+      <w:r>
+        <w:lastRenderedPageBreak/>
+        <w:t>tampon (</w:t>
+      </w:r>
+      <w:proofErr w:type="spellStart"/>
+      <w:r>
+        <w:t>BufferedGraphics</w:t>
+      </w:r>
+      <w:proofErr w:type="spellEnd"/>
+      <w:r>
+        <w:t>) pour éviter tout scintillement visuel. Elle maintient l'état global de la partie (score, vague courante, défaite), capture les entrées utilisateur (</w:t>
+      </w:r>
+      <w:proofErr w:type="spellStart"/>
+      <w:r>
+        <w:t>GameSpace_KeyDown</w:t>
+      </w:r>
+      <w:proofErr w:type="spellEnd"/>
+      <w:r>
+        <w:t>) et gère les collections dynamiques d'entités (_</w:t>
+      </w:r>
+      <w:proofErr w:type="spellStart"/>
+      <w:r>
+        <w:t>bullets</w:t>
+      </w:r>
+      <w:proofErr w:type="spellEnd"/>
+      <w:r>
+        <w:t>, _</w:t>
+      </w:r>
+      <w:proofErr w:type="spellStart"/>
+      <w:r>
+        <w:t>kintos</w:t>
+      </w:r>
+      <w:proofErr w:type="spellEnd"/>
+      <w:r>
+        <w:t>, _ennemis, _</w:t>
+      </w:r>
+      <w:proofErr w:type="spellStart"/>
+      <w:r>
+        <w:t>enemyBullets</w:t>
+      </w:r>
+      <w:proofErr w:type="spellEnd"/>
+      <w:r>
+        <w:t>).</w:t>
+      </w:r>
+    </w:p>
+    <w:p>
+      <w:pPr>
+        <w:pStyle w:val="Retraitcorpsdetexte3"/>
+        <w:ind w:left="709"/>
+      </w:pPr>
+      <w:r>
+        <w:rPr>
+          <w:b/>
+          <w:bCs/>
+        </w:rPr>
+        <w:t>Player (Le joueur / Goku) :</w:t>
+      </w:r>
+      <w:r>
+        <w:t xml:space="preserve"> Modélise le personnage contrôlé par le joueur. Cette classe gère ses coordonnées à l'écran, ses points de vie (</w:t>
+      </w:r>
+      <w:proofErr w:type="spellStart"/>
+      <w:r>
+        <w:t>hp</w:t>
+      </w:r>
+      <w:proofErr w:type="spellEnd"/>
+      <w:r>
+        <w:t>), ses limites de déplacement et vérifie les collisions physiques contre les obstacles intacts (</w:t>
+      </w:r>
+      <w:proofErr w:type="spellStart"/>
+      <w:r>
+        <w:t>ChangeDirection</w:t>
+      </w:r>
+      <w:proofErr w:type="spellEnd"/>
+      <w:r>
+        <w:t>).</w:t>
+      </w:r>
+    </w:p>
+    <w:p>
+      <w:pPr>
+        <w:pStyle w:val="Retraitcorpsdetexte3"/>
+        <w:ind w:left="709"/>
+      </w:pPr>
+      <w:r>
+        <w:rPr>
+          <w:b/>
+          <w:bCs/>
+        </w:rPr>
+        <w:t xml:space="preserve">Ennemis (Les </w:t>
+      </w:r>
+      <w:proofErr w:type="spellStart"/>
+      <w:r>
+        <w:rPr>
+          <w:b/>
+          <w:bCs/>
+        </w:rPr>
+        <w:t>Saibamens</w:t>
+      </w:r>
+      <w:proofErr w:type="spellEnd"/>
+      <w:r>
+        <w:rPr>
+          <w:b/>
+          <w:bCs/>
+        </w:rPr>
+        <w:t>) :</w:t>
+      </w:r>
+      <w:r>
+        <w:t xml:space="preserve"> Représente les adversaires apparaissant par vagues. Chaque </w:t>
+      </w:r>
+      <w:proofErr w:type="spellStart"/>
+      <w:r>
+        <w:t>Saibamen</w:t>
+      </w:r>
+      <w:proofErr w:type="spellEnd"/>
+      <w:r>
+        <w:t xml:space="preserve"> possède son propre état de déplacement (</w:t>
+      </w:r>
+      <w:proofErr w:type="spellStart"/>
+      <w:r>
+        <w:t>State.TRAVELLING</w:t>
+      </w:r>
+      <w:proofErr w:type="spellEnd"/>
+      <w:r>
+        <w:t>), ses points de vie, un délai de tir autonome (_</w:t>
+      </w:r>
+      <w:proofErr w:type="spellStart"/>
+      <w:r>
+        <w:t>shootCooldown</w:t>
+      </w:r>
+      <w:proofErr w:type="spellEnd"/>
+      <w:r>
+        <w:t xml:space="preserve">, </w:t>
+      </w:r>
+      <w:proofErr w:type="spellStart"/>
+      <w:proofErr w:type="gramStart"/>
+      <w:r>
+        <w:t>TryShoot</w:t>
+      </w:r>
+      <w:proofErr w:type="spellEnd"/>
+      <w:r>
+        <w:t>(</w:t>
+      </w:r>
+      <w:proofErr w:type="gramEnd"/>
+      <w:r>
+        <w:t>)) et accorde une valeur de score fixe (POINTS_VALUE = 100) lors de sa destruction.</w:t>
+      </w:r>
+    </w:p>
+    <w:p>
+      <w:pPr>
+        <w:pStyle w:val="Retraitcorpsdetexte3"/>
+        <w:ind w:left="709"/>
+      </w:pPr>
+      <w:r>
+        <w:rPr>
+          <w:b/>
+          <w:bCs/>
+        </w:rPr>
+        <w:t>Kinto (Protections et boucliers) :</w:t>
+      </w:r>
+      <w:r>
+        <w:t xml:space="preserve"> Gère les 5 nuages de protection destructibles. La classe encapsule une logique de durabilité (</w:t>
+      </w:r>
+      <w:proofErr w:type="spellStart"/>
+      <w:r>
+        <w:t>Hp</w:t>
+      </w:r>
+      <w:proofErr w:type="spellEnd"/>
+      <w:r>
+        <w:t>, MAX_HP = 3). Dès qu'un nuage est détruit, sa boîte de collision se désactive immédiatement et un minuteur interne (</w:t>
+      </w:r>
+      <w:proofErr w:type="spellStart"/>
+      <w:r>
+        <w:t>respawnTimer</w:t>
+      </w:r>
+      <w:proofErr w:type="spellEnd"/>
+      <w:r>
+        <w:t>) déclenche sa régénération complète après un délai de 15 secondes (RESPAWN_DELAY).</w:t>
+      </w:r>
+    </w:p>
+    <w:p>
+      <w:pPr>
+        <w:pStyle w:val="Retraitcorpsdetexte3"/>
+        <w:ind w:left="709"/>
+      </w:pPr>
+      <w:r>
+        <w:rPr>
+          <w:b/>
+          <w:bCs/>
+        </w:rPr>
+        <w:t xml:space="preserve">Tirs et </w:t>
+      </w:r>
+      <w:proofErr w:type="spellStart"/>
+      <w:r>
+        <w:rPr>
+          <w:b/>
+          <w:bCs/>
+        </w:rPr>
+        <w:t>TirEnnemi</w:t>
+      </w:r>
+      <w:proofErr w:type="spellEnd"/>
+      <w:r>
+        <w:rPr>
+          <w:b/>
+          <w:bCs/>
+        </w:rPr>
+        <w:t xml:space="preserve"> (Projectiles) :</w:t>
+      </w:r>
+      <w:r>
+        <w:t xml:space="preserve"> Ces deux classes modélisent respectivement les tirs alliés et ennemis. Elles encapsulent leur vitesse de déplacement vectorielle (_</w:t>
+      </w:r>
+      <w:proofErr w:type="spellStart"/>
+      <w:r>
+        <w:t>dirx</w:t>
+      </w:r>
+      <w:proofErr w:type="spellEnd"/>
+      <w:r>
+        <w:t>, _</w:t>
+      </w:r>
+      <w:proofErr w:type="spellStart"/>
+      <w:r>
+        <w:t>diry</w:t>
+      </w:r>
+      <w:proofErr w:type="spellEnd"/>
+      <w:r>
+        <w:t>) calculée à l'instanciation en fonction de la cible ou du curseur.</w:t>
+      </w:r>
+    </w:p>
+    <w:p>
+      <w:pPr>
+        <w:pStyle w:val="Retraitcorpsdetexte3"/>
+        <w:ind w:left="709"/>
+      </w:pPr>
+      <w:proofErr w:type="spellStart"/>
+      <w:r>
+        <w:rPr>
+          <w:b/>
+          <w:bCs/>
+        </w:rPr>
+        <w:t>MathHelpers</w:t>
+      </w:r>
+      <w:proofErr w:type="spellEnd"/>
+      <w:r>
+        <w:rPr>
+          <w:b/>
+          <w:bCs/>
+        </w:rPr>
+        <w:t xml:space="preserve"> (Classe utilitaire statique) :</w:t>
+      </w:r>
+      <w:r>
+        <w:t xml:space="preserve"> Fournit la méthode </w:t>
+      </w:r>
+      <w:proofErr w:type="gramStart"/>
+      <w:r>
+        <w:t>Distance(</w:t>
+      </w:r>
+      <w:proofErr w:type="gramEnd"/>
+      <w:r>
+        <w:t>) utilisée par les classes de projectiles pour déterminer les trajectoires normalisées et valider la détection des collisions euclidiennes.</w:t>
+      </w:r>
+    </w:p>
+    <w:p/>
+    <w:p>
+      <w:pPr>
         <w:pStyle w:val="Titre2"/>
       </w:pPr>
       <w:bookmarkStart w:id="21" w:name="_Toc244269433"/>
       <w:r>
+        <w:t xml:space="preserve">Explication </w:t>
+      </w:r>
+      <w:r>
+        <w:t>d’utilisation</w:t>
+      </w:r>
+      <w:r>
+        <w:t xml:space="preserve"> de </w:t>
+      </w:r>
+      <w:proofErr w:type="spellStart"/>
+      <w:r>
+        <w:t>l’ia</w:t>
+      </w:r>
+      <w:proofErr w:type="spellEnd"/>
+      <w:r>
+        <w:t xml:space="preserve"> dans ce projet</w:t>
+      </w:r>
+      <w:bookmarkEnd w:id="21"/>
+    </w:p>
+    <w:p>
+      <w:pPr>
+        <w:pStyle w:val="Retraitcorpsdetexte"/>
+        <w:ind w:left="709"/>
+      </w:pPr>
+      <w:r>
+        <w:t xml:space="preserve">J’ai utilisé </w:t>
+      </w:r>
+      <w:proofErr w:type="spellStart"/>
+      <w:r>
+        <w:t>l’ia</w:t>
+      </w:r>
+      <w:proofErr w:type="spellEnd"/>
+      <w:r>
+        <w:t xml:space="preserve"> afin de comprendre les concepts qui m’échappaient, j’ai eu de nombreuse difficulté lors de ce projet </w:t>
+      </w:r>
+      <w:proofErr w:type="spellStart"/>
+      <w:r>
+        <w:t>l’ia</w:t>
+      </w:r>
+      <w:proofErr w:type="spellEnd"/>
+      <w:r>
+        <w:t xml:space="preserve"> m’a permis de tout de même continuer à progresser</w:t>
+      </w:r>
+      <w:r>
+        <w:t xml:space="preserve"> et à maintenir un rythme convenable et soutenu.</w:t>
+      </w:r>
+    </w:p>
+    <w:p>
+      <w:pPr>
+        <w:pStyle w:val="Retraitcorpsdetexte"/>
+        <w:ind w:left="709"/>
+      </w:pPr>
+    </w:p>
+    <w:p>
+      <w:pPr>
+        <w:pStyle w:val="Sous-titre"/>
+        <w:ind w:left="709"/>
+      </w:pPr>
+      <w:r>
+        <w:t>La rotation des tirs</w:t>
+      </w:r>
+    </w:p>
+    <w:p>
+      <w:pPr>
+        <w:ind w:left="709"/>
+      </w:pPr>
+      <w:r>
+        <w:t xml:space="preserve">J’ai été aidé par </w:t>
+      </w:r>
+      <w:proofErr w:type="spellStart"/>
+      <w:r>
+        <w:t>l’ia</w:t>
+      </w:r>
+      <w:proofErr w:type="spellEnd"/>
+      <w:r>
+        <w:t xml:space="preserve"> afin de réaliser cette partie car je bloquais dessus, elle m’a permis d’avancer et mieux comprendre ce concept.</w:t>
+      </w:r>
+    </w:p>
+    <w:p>
+      <w:pPr>
+        <w:ind w:left="709"/>
+      </w:pPr>
+    </w:p>
+    <w:p>
+      <w:pPr>
+        <w:pStyle w:val="Sous-titre"/>
+        <w:ind w:left="709"/>
+      </w:pPr>
+      <w:r>
+        <w:t>Les commentaires</w:t>
+      </w:r>
+    </w:p>
+    <w:p>
+      <w:pPr>
+        <w:ind w:left="709"/>
+      </w:pPr>
+      <w:r>
+        <w:t>A la fin du projet j’ai décidé d’ajouter des commentaires grâce à l’aide de l’Ia afin de rendre mon code plus facilement transmissible et compréhensible.</w:t>
+      </w:r>
+    </w:p>
+    <w:p>
+      <w:pPr>
+        <w:ind w:left="709"/>
+      </w:pPr>
+    </w:p>
+    <w:p>
+      <w:pPr>
+        <w:pStyle w:val="Sous-titre"/>
+        <w:ind w:left="709"/>
+      </w:pPr>
+      <w:r>
+        <w:t>Les images</w:t>
+      </w:r>
+    </w:p>
+    <w:p>
+      <w:pPr>
+        <w:ind w:left="709"/>
+      </w:pPr>
+      <w:r>
+        <w:t xml:space="preserve">J’ai généré par </w:t>
+      </w:r>
+      <w:proofErr w:type="spellStart"/>
+      <w:r>
+        <w:t>ia</w:t>
+      </w:r>
+      <w:proofErr w:type="spellEnd"/>
+      <w:r>
+        <w:t xml:space="preserve"> l’entièreté des images afin d’éviter des problèmes de droits et d’obtenir exactement l’image que je recherchais, veuillez tout de même </w:t>
+      </w:r>
+      <w:proofErr w:type="gramStart"/>
+      <w:r>
+        <w:t>noté</w:t>
+      </w:r>
+      <w:proofErr w:type="gramEnd"/>
+      <w:r>
+        <w:t xml:space="preserve"> que j’ai retravailler les images sur </w:t>
+      </w:r>
+      <w:proofErr w:type="spellStart"/>
+      <w:r>
+        <w:t>photoshop</w:t>
+      </w:r>
+      <w:proofErr w:type="spellEnd"/>
+      <w:r>
+        <w:t xml:space="preserve"> et je les ai </w:t>
+      </w:r>
+      <w:r>
+        <w:t>pixellisés</w:t>
+      </w:r>
+      <w:r>
+        <w:t xml:space="preserve"> pour réduire leur taille et le ralentissement qu’elles causaient</w:t>
+      </w:r>
+      <w:r>
+        <w:t>.</w:t>
+      </w:r>
+    </w:p>
+    <w:p>
+      <w:pPr>
+        <w:ind w:left="709"/>
+      </w:pPr>
+    </w:p>
+    <w:p>
+      <w:pPr>
+        <w:pStyle w:val="Sous-titre"/>
+        <w:ind w:left="709"/>
+      </w:pPr>
+      <w:r>
+        <w:t>Des informations</w:t>
+      </w:r>
+    </w:p>
+    <w:p>
+      <w:pPr>
+        <w:ind w:left="709"/>
+      </w:pPr>
+      <w:r>
+        <w:t xml:space="preserve">J’ai utilisé </w:t>
+      </w:r>
+      <w:proofErr w:type="spellStart"/>
+      <w:r>
+        <w:t>l’ia</w:t>
+      </w:r>
+      <w:proofErr w:type="spellEnd"/>
+      <w:r>
+        <w:t xml:space="preserve"> pour toutes sorte de question technique et conseil tout au long du projet, j’ai souvent remplacé une simple recherche internet par un prompt afin de pouvoir optimiser mon travail et mes recherches.</w:t>
+      </w:r>
+    </w:p>
+    <w:p>
+      <w:r>
+        <w:br w:type="page"/>
+      </w:r>
+    </w:p>
+    <w:p>
+      <w:pPr>
+        <w:pStyle w:val="Sous-titre"/>
+        <w:ind w:left="709"/>
+      </w:pPr>
+      <w:r>
         <w:lastRenderedPageBreak/>
-        <w:t xml:space="preserve">Explication </w:t>
+        <w:t>Le rapport</w:t>
+      </w:r>
+    </w:p>
+    <w:p>
+      <w:pPr>
+        <w:ind w:left="709"/>
+      </w:pPr>
+      <w:r>
+        <w:t xml:space="preserve">J’ai utilisé </w:t>
+      </w:r>
+      <w:proofErr w:type="spellStart"/>
+      <w:r>
+        <w:t>l’ia</w:t>
+      </w:r>
+      <w:proofErr w:type="spellEnd"/>
+      <w:r>
+        <w:t xml:space="preserve"> pour la reformulation de certaine phrase au sein du rapport, la </w:t>
+      </w:r>
+      <w:proofErr w:type="spellStart"/>
+      <w:r>
+        <w:t>verification</w:t>
+      </w:r>
+      <w:proofErr w:type="spellEnd"/>
+      <w:r>
+        <w:t xml:space="preserve"> du contenu face au </w:t>
+      </w:r>
+      <w:proofErr w:type="spellStart"/>
+      <w:r>
+        <w:t>CdC</w:t>
+      </w:r>
+      <w:proofErr w:type="spellEnd"/>
+      <w:r>
+        <w:t xml:space="preserve"> et </w:t>
+      </w:r>
+      <w:r>
+        <w:t>aux attentes soumises</w:t>
+      </w:r>
+      <w:r>
+        <w:t xml:space="preserve"> lors du module.</w:t>
+      </w:r>
+    </w:p>
+    <w:p>
+      <w:pPr>
+        <w:pStyle w:val="Titre2"/>
+      </w:pPr>
+      <w:bookmarkStart w:id="22" w:name="_Toc244269434"/>
+      <w:r>
+        <w:t>Bilan</w:t>
+      </w:r>
+      <w:r>
+        <w:t xml:space="preserve"> du déroulement du projet</w:t>
+      </w:r>
+      <w:bookmarkEnd w:id="22"/>
+    </w:p>
+    <w:p>
+      <w:pPr>
+        <w:pStyle w:val="Retraitcorpsdetexte"/>
+        <w:ind w:left="709"/>
+      </w:pPr>
+      <w:r>
+        <w:t xml:space="preserve">Le déroulement global de ce projet a été très formateur mais marqué par une courbe d'apprentissage abrupte. Au commencement, la transition vers une architecture pleinement orientée objet et l'adaptation à la base de code existante </w:t>
+      </w:r>
+      <w:r>
+        <w:t>a</w:t>
+      </w:r>
+      <w:r>
+        <w:t xml:space="preserve"> nécessité un temps d'appropriation important, ce qui a légèrement ralenti la mise en place de la première User Story. J'ai également dû réajuster mon planning initial </w:t>
       </w:r>
       <w:proofErr w:type="gramStart"/>
       <w:r>
-        <w:t>de utilisation</w:t>
+        <w:t>suite à des imprévus</w:t>
       </w:r>
       <w:proofErr w:type="gramEnd"/>
       <w:r>
-        <w:t xml:space="preserve"> de </w:t>
+        <w:t xml:space="preserve"> d'emploi du temps (notamment une demi-journée banalisée pour la remise de prix).</w:t>
+      </w:r>
+    </w:p>
+    <w:p>
+      <w:pPr>
+        <w:pStyle w:val="Titre2"/>
+      </w:pPr>
+      <w:bookmarkStart w:id="23" w:name="_Toc244269435"/>
+      <w:r>
+        <w:t>Bilan Produit</w:t>
+      </w:r>
+      <w:bookmarkEnd w:id="23"/>
+    </w:p>
+    <w:p>
+      <w:pPr>
+        <w:pStyle w:val="Retraitcorpsdetexte"/>
+        <w:ind w:left="709"/>
+      </w:pPr>
+      <w:r>
+        <w:t>Le produit final répond fidèlement aux exigences fonctionnelles définies dans le cahier des charges initial. L'ensemble des mécaniques obligatoires a été implémenté avec succès :</w:t>
+      </w:r>
+    </w:p>
+    <w:p>
+      <w:pPr>
+        <w:pStyle w:val="Retraitcorpsdetexte"/>
+        <w:numPr>
+          <w:ilvl w:val="0"/>
+          <w:numId w:val="7"/>
+        </w:numPr>
+      </w:pPr>
+      <w:r>
+        <w:t>Le contrôle réactif de Goku au clavier (W, A, S, D et touches directionnelles) délimité dans sa zone de jeu.</w:t>
+      </w:r>
+    </w:p>
+    <w:p>
+      <w:pPr>
+        <w:pStyle w:val="Retraitcorpsdetexte"/>
+        <w:ind w:left="720"/>
+      </w:pPr>
+    </w:p>
+    <w:p>
+      <w:pPr>
+        <w:pStyle w:val="Retraitcorpsdetexte"/>
+        <w:numPr>
+          <w:ilvl w:val="0"/>
+          <w:numId w:val="7"/>
+        </w:numPr>
+      </w:pPr>
+      <w:r>
+        <w:t xml:space="preserve">Une vague de départ d'au moins dix </w:t>
       </w:r>
       <w:proofErr w:type="spellStart"/>
       <w:r>
-        <w:t>l’ia</w:t>
+        <w:t>Saibamens</w:t>
       </w:r>
       <w:proofErr w:type="spellEnd"/>
       <w:r>
-        <w:t xml:space="preserve"> dans ce projet</w:t>
-      </w:r>
-      <w:bookmarkEnd w:id="21"/>
+        <w:t xml:space="preserve"> avec gestion dynamique de leurs déplacements, tirs périodiques et passage en mode assaut au corps-à-corps.</w:t>
+      </w:r>
     </w:p>
     <w:p>
       <w:pPr>
         <w:pStyle w:val="Retraitcorpsdetexte"/>
-        <w:ind w:left="709"/>
-      </w:pPr>
-      <w:r>
-        <w:t xml:space="preserve">J’ai utilisé </w:t>
+        <w:ind w:left="720"/>
+      </w:pPr>
+    </w:p>
+    <w:p>
+      <w:pPr>
+        <w:pStyle w:val="Retraitcorpsdetexte"/>
+        <w:numPr>
+          <w:ilvl w:val="0"/>
+          <w:numId w:val="7"/>
+        </w:numPr>
+      </w:pPr>
+      <w:r>
+        <w:t>Les cinq nuages Kinto agissant comme protections destructibles communes et dotés d'un système autonome de régénération après 15 secondes.</w:t>
+      </w:r>
+    </w:p>
+    <w:p>
+      <w:pPr>
+        <w:pStyle w:val="Retraitcorpsdetexte"/>
+        <w:ind w:left="720"/>
+      </w:pPr>
+    </w:p>
+    <w:p>
+      <w:pPr>
+        <w:pStyle w:val="Retraitcorpsdetexte"/>
+        <w:numPr>
+          <w:ilvl w:val="0"/>
+          <w:numId w:val="7"/>
+        </w:numPr>
+      </w:pPr>
+      <w:r>
+        <w:t>L'affichage en temps réel du score, de la vie du joueur et du rechargement de tir dans l'ATH, complété par la gestion d'un Game Over avec réinitialisation de la partie.</w:t>
+      </w:r>
+    </w:p>
+    <w:p>
+      <w:pPr>
+        <w:pStyle w:val="Retraitcorpsdetexte"/>
+        <w:ind w:left="720"/>
+      </w:pPr>
+    </w:p>
+    <w:p>
+      <w:pPr>
+        <w:pStyle w:val="Retraitcorpsdetexte"/>
+        <w:ind w:left="709"/>
+      </w:pPr>
+      <w:r>
+        <w:t xml:space="preserve">Concernant les fonctionnalités optionnelles, l'US6 (l'attaque de masse </w:t>
       </w:r>
       <w:proofErr w:type="spellStart"/>
       <w:r>
-        <w:t>l’ia</w:t>
+        <w:t>Genkidama</w:t>
       </w:r>
       <w:proofErr w:type="spellEnd"/>
       <w:r>
-        <w:t xml:space="preserve"> afin de comprendre les concepts qui m’échappaient, j’ai eu de nombreuse difficulté lors de ce projet </w:t>
-      </w:r>
-      <w:proofErr w:type="spellStart"/>
-      <w:r>
-        <w:t>l’ia</w:t>
-      </w:r>
-      <w:proofErr w:type="spellEnd"/>
-      <w:r>
-        <w:t xml:space="preserve"> m’a permis de tout de même continuer à progresser</w:t>
-      </w:r>
-      <w:r>
-        <w:t xml:space="preserve"> et à maintenir un rythme convenable et soutenu.</w:t>
+        <w:t xml:space="preserve">) n'a </w:t>
+      </w:r>
+      <w:r>
+        <w:t>pas pu être réalisée du au manque de temps j’ai préféré me concentrer sur l’essentiel.</w:t>
       </w:r>
     </w:p>
     <w:p>
@@ -4423,260 +5051,25 @@
     </w:p>
     <w:p>
       <w:pPr>
-        <w:pStyle w:val="Sous-titre"/>
-        <w:ind w:left="709"/>
-      </w:pPr>
-      <w:r>
-        <w:t>La rotation des tirs</w:t>
-      </w:r>
-    </w:p>
-    <w:p>
-      <w:pPr>
-        <w:ind w:left="709"/>
-      </w:pPr>
-      <w:r>
-        <w:t xml:space="preserve">J’ai été aidé par </w:t>
-      </w:r>
-      <w:proofErr w:type="spellStart"/>
-      <w:r>
-        <w:t>l’ia</w:t>
-      </w:r>
-      <w:proofErr w:type="spellEnd"/>
-      <w:r>
-        <w:t xml:space="preserve"> afin de réaliser cette partie car je bloquais dessus, elle m’a permis d’avancer et mieux comprendre ce concept.</w:t>
-      </w:r>
-    </w:p>
-    <w:p>
-      <w:pPr>
-        <w:ind w:left="709"/>
-      </w:pPr>
-    </w:p>
-    <w:p>
-      <w:pPr>
-        <w:pStyle w:val="Sous-titre"/>
-        <w:ind w:left="709"/>
-      </w:pPr>
-      <w:r>
-        <w:t>Les commentaires</w:t>
-      </w:r>
-    </w:p>
-    <w:p>
-      <w:pPr>
-        <w:ind w:left="709"/>
-      </w:pPr>
-      <w:r>
-        <w:t>A la fin du projet j’ai décidé d’ajouter des commentaires grâce à l’aide de l’Ia afin de rendre mon code plus facilement transmissible et compréhensible.</w:t>
-      </w:r>
-    </w:p>
-    <w:p>
-      <w:pPr>
-        <w:ind w:left="709"/>
-      </w:pPr>
-    </w:p>
-    <w:p>
-      <w:pPr>
-        <w:pStyle w:val="Sous-titre"/>
-        <w:ind w:left="709"/>
-      </w:pPr>
-      <w:r>
-        <w:t>Les images</w:t>
-      </w:r>
-    </w:p>
-    <w:p>
-      <w:pPr>
-        <w:ind w:left="709"/>
-      </w:pPr>
-      <w:r>
-        <w:t xml:space="preserve">J’ai généré par </w:t>
-      </w:r>
-      <w:proofErr w:type="spellStart"/>
-      <w:r>
-        <w:t>ia</w:t>
-      </w:r>
-      <w:proofErr w:type="spellEnd"/>
-      <w:r>
-        <w:t xml:space="preserve"> l’entièreté des images afin d’éviter des problèmes de droits et d’obtenir exactement l’image que je recherchais, veuillez tout de même </w:t>
-      </w:r>
-      <w:proofErr w:type="gramStart"/>
-      <w:r>
-        <w:t>noté</w:t>
-      </w:r>
-      <w:proofErr w:type="gramEnd"/>
-      <w:r>
-        <w:t xml:space="preserve"> que j’ai retravailler les images sur </w:t>
-      </w:r>
-      <w:proofErr w:type="spellStart"/>
-      <w:r>
-        <w:t>photoshop</w:t>
-      </w:r>
-      <w:proofErr w:type="spellEnd"/>
-      <w:r>
-        <w:t xml:space="preserve"> et je les ai </w:t>
-      </w:r>
-      <w:r>
-        <w:t>pixellisés</w:t>
-      </w:r>
-      <w:r>
-        <w:t xml:space="preserve"> pour réduire leur taille et le ralentissement qu’elles causaient</w:t>
-      </w:r>
-      <w:r>
-        <w:t>.</w:t>
-      </w:r>
-    </w:p>
-    <w:p>
-      <w:pPr>
-        <w:ind w:left="709"/>
-      </w:pPr>
-    </w:p>
-    <w:p>
-      <w:pPr>
-        <w:pStyle w:val="Sous-titre"/>
-        <w:ind w:left="709"/>
-      </w:pPr>
-      <w:r>
-        <w:t>Des informations</w:t>
-      </w:r>
-    </w:p>
-    <w:p>
-      <w:pPr>
-        <w:ind w:left="709"/>
-      </w:pPr>
-      <w:r>
-        <w:t xml:space="preserve">J’ai utilisé </w:t>
-      </w:r>
-      <w:proofErr w:type="spellStart"/>
-      <w:r>
-        <w:t>l’ia</w:t>
-      </w:r>
-      <w:proofErr w:type="spellEnd"/>
-      <w:r>
-        <w:t xml:space="preserve"> pour toutes sorte de question technique et conseil tout au long du projet, j’ai souvent remplacé une simple recherche internet par un prompt afin de pouvoir optimiser mon travail et mes recherches.</w:t>
-      </w:r>
+        <w:pStyle w:val="Titre2"/>
+      </w:pPr>
+      <w:bookmarkStart w:id="24" w:name="_Toc244269436"/>
+      <w:r>
+        <w:t>Conclusion</w:t>
+      </w:r>
+      <w:bookmarkEnd w:id="24"/>
     </w:p>
     <w:p>
       <w:pPr>
         <w:pStyle w:val="Retraitcorpsdetexte"/>
         <w:ind w:left="709"/>
       </w:pPr>
-    </w:p>
-    <w:p>
-      <w:pPr>
-        <w:pStyle w:val="Retraitcorpsdetexte"/>
-        <w:ind w:left="709"/>
-      </w:pPr>
-    </w:p>
-    <w:p>
-      <w:pPr>
-        <w:pStyle w:val="Titre2"/>
-      </w:pPr>
-      <w:bookmarkStart w:id="22" w:name="_Toc244269434"/>
-      <w:r>
-        <w:t>Bilan</w:t>
-      </w:r>
-      <w:r>
-        <w:t xml:space="preserve"> du déroulement du projet</w:t>
-      </w:r>
-      <w:bookmarkEnd w:id="22"/>
-    </w:p>
-    <w:p>
-      <w:pPr>
-        <w:pStyle w:val="Retraitcorpsdetexte"/>
-        <w:ind w:left="709"/>
-      </w:pPr>
-      <w:r>
-        <w:t xml:space="preserve">Le projet s'est déroulé de façon constructive malgré un démarrage qui demandait un temps d'adaptation important pour appréhender </w:t>
-      </w:r>
-      <w:proofErr w:type="gramStart"/>
-      <w:r>
-        <w:t>le</w:t>
-      </w:r>
-      <w:r>
-        <w:t xml:space="preserve"> Orienté</w:t>
-      </w:r>
-      <w:proofErr w:type="gramEnd"/>
-      <w:r>
-        <w:t xml:space="preserve"> objet</w:t>
-      </w:r>
-      <w:r>
-        <w:t>.</w:t>
-      </w:r>
-    </w:p>
-    <w:p>
-      <w:pPr>
-        <w:pStyle w:val="Retraitcorpsdetexte"/>
-        <w:ind w:left="709"/>
-      </w:pPr>
-    </w:p>
-    <w:p>
-      <w:pPr>
-        <w:pStyle w:val="Titre2"/>
-      </w:pPr>
-      <w:bookmarkStart w:id="23" w:name="_Toc244269435"/>
-      <w:r>
-        <w:t>Bilan Produit</w:t>
-      </w:r>
-      <w:bookmarkEnd w:id="23"/>
-    </w:p>
-    <w:p>
-      <w:pPr>
-        <w:pStyle w:val="Retraitcorpsdetexte"/>
-        <w:ind w:left="709"/>
-      </w:pPr>
-      <w:r>
-        <w:t>Le résultat final correspond aux attentes du cahier des charges et de mes attentes.</w:t>
-      </w:r>
-    </w:p>
-    <w:p>
-      <w:pPr>
-        <w:pStyle w:val="Retraitcorpsdetexte"/>
-        <w:ind w:left="709"/>
-      </w:pPr>
-      <w:r>
-        <w:t xml:space="preserve">Il satisfait toutes les attentes d’un </w:t>
-      </w:r>
-      <w:proofErr w:type="spellStart"/>
-      <w:r>
-        <w:t>Shoot’em</w:t>
-      </w:r>
-      <w:proofErr w:type="spellEnd"/>
-      <w:r>
-        <w:t xml:space="preserve"> Up classique et respecte le thème de dragon </w:t>
-      </w:r>
-      <w:proofErr w:type="spellStart"/>
-      <w:r>
-        <w:t>ball</w:t>
-      </w:r>
-      <w:proofErr w:type="spellEnd"/>
-    </w:p>
-    <w:p>
-      <w:pPr>
-        <w:pStyle w:val="Retraitcorpsdetexte"/>
-        <w:ind w:left="709"/>
-      </w:pPr>
-    </w:p>
-    <w:p>
-      <w:pPr>
-        <w:pStyle w:val="Titre2"/>
-      </w:pPr>
-      <w:bookmarkStart w:id="24" w:name="_Toc244269436"/>
-      <w:r>
-        <w:t>Conclusion</w:t>
-      </w:r>
-      <w:bookmarkEnd w:id="24"/>
-    </w:p>
-    <w:p>
-      <w:pPr>
-        <w:pStyle w:val="Retraitcorpsdetexte"/>
-        <w:ind w:left="709"/>
-      </w:pPr>
       <w:r>
         <w:t xml:space="preserve">En conclusion, ce projet m’a permis de progresser et de grandement améliorer ma persévérance même dans la difficulté, mais j’ai tout de même beaucoup </w:t>
       </w:r>
-      <w:proofErr w:type="gramStart"/>
-      <w:r>
-        <w:t>apprécier</w:t>
-      </w:r>
-      <w:proofErr w:type="gramEnd"/>
+      <w:r>
+        <w:t>apprécié</w:t>
+      </w:r>
       <w:r>
         <w:t xml:space="preserve"> travailler sur ce projet et m’a apporté l’envie d’apprendre plus.</w:t>
       </w:r>
@@ -5096,7 +5489,7 @@
               <w:noProof/>
               <w:szCs w:val="16"/>
             </w:rPr>
-            <w:t>04.09.2026 16:23</w:t>
+            <w:t>31.10.2026 10:51</w:t>
           </w:r>
           <w:r>
             <w:rPr>
@@ -5148,7 +5541,7 @@
                 <w:noProof/>
                 <w:szCs w:val="16"/>
               </w:rPr>
-              <w:t>4</w:t>
+              <w:t>12</w:t>
             </w:r>
           </w:fldSimple>
           <w:r>
@@ -5185,7 +5578,7 @@
               <w:noProof/>
               <w:szCs w:val="16"/>
             </w:rPr>
-            <w:t>11.09.2026 14:42</w:t>
+            <w:t>31.10.2026 10:51</w:t>
           </w:r>
           <w:r>
             <w:rPr>
@@ -5300,9 +5693,9 @@
       <w:tblLook w:val="01E0" w:firstRow="1" w:lastRow="1" w:firstColumn="1" w:lastColumn="1" w:noHBand="0" w:noVBand="0"/>
     </w:tblPr>
     <w:tblGrid>
-      <w:gridCol w:w="2402"/>
-      <w:gridCol w:w="4400"/>
-      <w:gridCol w:w="2268"/>
+      <w:gridCol w:w="2390"/>
+      <w:gridCol w:w="4411"/>
+      <w:gridCol w:w="2269"/>
     </w:tblGrid>
     <w:tr>
       <w:trPr>
@@ -5827,6 +6220,155 @@
     </w:lvl>
   </w:abstractNum>
   <w:abstractNum w:abstractNumId="4" w15:restartNumberingAfterBreak="0">
+    <w:nsid w:val="29A84A6D"/>
+    <w:multiLevelType w:val="multilevel"/>
+    <w:tmpl w:val="0FC8C1A2"/>
+    <w:lvl w:ilvl="0">
+      <w:start w:val="1"/>
+      <w:numFmt w:val="bullet"/>
+      <w:lvlText w:val=""/>
+      <w:lvlJc w:val="left"/>
+      <w:pPr>
+        <w:tabs>
+          <w:tab w:val="num" w:pos="720"/>
+        </w:tabs>
+        <w:ind w:left="720" w:hanging="360"/>
+      </w:pPr>
+      <w:rPr>
+        <w:rFonts w:ascii="Symbol" w:hAnsi="Symbol" w:hint="default"/>
+        <w:sz w:val="20"/>
+      </w:rPr>
+    </w:lvl>
+    <w:lvl w:ilvl="1" w:tentative="1">
+      <w:start w:val="1"/>
+      <w:numFmt w:val="bullet"/>
+      <w:lvlText w:val="o"/>
+      <w:lvlJc w:val="left"/>
+      <w:pPr>
+        <w:tabs>
+          <w:tab w:val="num" w:pos="1440"/>
+        </w:tabs>
+        <w:ind w:left="1440" w:hanging="360"/>
+      </w:pPr>
+      <w:rPr>
+        <w:rFonts w:ascii="Courier New" w:hAnsi="Courier New" w:hint="default"/>
+        <w:sz w:val="20"/>
+      </w:rPr>
+    </w:lvl>
+    <w:lvl w:ilvl="2" w:tentative="1">
+      <w:start w:val="1"/>
+      <w:numFmt w:val="bullet"/>
+      <w:lvlText w:val=""/>
+      <w:lvlJc w:val="left"/>
+      <w:pPr>
+        <w:tabs>
+          <w:tab w:val="num" w:pos="2160"/>
+        </w:tabs>
+        <w:ind w:left="2160" w:hanging="360"/>
+      </w:pPr>
+      <w:rPr>
+        <w:rFonts w:ascii="Wingdings" w:hAnsi="Wingdings" w:hint="default"/>
+        <w:sz w:val="20"/>
+      </w:rPr>
+    </w:lvl>
+    <w:lvl w:ilvl="3" w:tentative="1">
+      <w:start w:val="1"/>
+      <w:numFmt w:val="bullet"/>
+      <w:lvlText w:val=""/>
+      <w:lvlJc w:val="left"/>
+      <w:pPr>
+        <w:tabs>
+          <w:tab w:val="num" w:pos="2880"/>
+        </w:tabs>
+        <w:ind w:left="2880" w:hanging="360"/>
+      </w:pPr>
+      <w:rPr>
+        <w:rFonts w:ascii="Wingdings" w:hAnsi="Wingdings" w:hint="default"/>
+        <w:sz w:val="20"/>
+      </w:rPr>
+    </w:lvl>
+    <w:lvl w:ilvl="4" w:tentative="1">
+      <w:start w:val="1"/>
+      <w:numFmt w:val="bullet"/>
+      <w:lvlText w:val=""/>
+      <w:lvlJc w:val="left"/>
+      <w:pPr>
+        <w:tabs>
+          <w:tab w:val="num" w:pos="3600"/>
+        </w:tabs>
+        <w:ind w:left="3600" w:hanging="360"/>
+      </w:pPr>
+      <w:rPr>
+        <w:rFonts w:ascii="Wingdings" w:hAnsi="Wingdings" w:hint="default"/>
+        <w:sz w:val="20"/>
+      </w:rPr>
+    </w:lvl>
+    <w:lvl w:ilvl="5" w:tentative="1">
+      <w:start w:val="1"/>
+      <w:numFmt w:val="bullet"/>
+      <w:lvlText w:val=""/>
+      <w:lvlJc w:val="left"/>
+      <w:pPr>
+        <w:tabs>
+          <w:tab w:val="num" w:pos="4320"/>
+        </w:tabs>
+        <w:ind w:left="4320" w:hanging="360"/>
+      </w:pPr>
+      <w:rPr>
+        <w:rFonts w:ascii="Wingdings" w:hAnsi="Wingdings" w:hint="default"/>
+        <w:sz w:val="20"/>
+      </w:rPr>
+    </w:lvl>
+    <w:lvl w:ilvl="6" w:tentative="1">
+      <w:start w:val="1"/>
+      <w:numFmt w:val="bullet"/>
+      <w:lvlText w:val=""/>
+      <w:lvlJc w:val="left"/>
+      <w:pPr>
+        <w:tabs>
+          <w:tab w:val="num" w:pos="5040"/>
+        </w:tabs>
+        <w:ind w:left="5040" w:hanging="360"/>
+      </w:pPr>
+      <w:rPr>
+        <w:rFonts w:ascii="Wingdings" w:hAnsi="Wingdings" w:hint="default"/>
+        <w:sz w:val="20"/>
+      </w:rPr>
+    </w:lvl>
+    <w:lvl w:ilvl="7" w:tentative="1">
+      <w:start w:val="1"/>
+      <w:numFmt w:val="bullet"/>
+      <w:lvlText w:val=""/>
+      <w:lvlJc w:val="left"/>
+      <w:pPr>
+        <w:tabs>
+          <w:tab w:val="num" w:pos="5760"/>
+        </w:tabs>
+        <w:ind w:left="5760" w:hanging="360"/>
+      </w:pPr>
+      <w:rPr>
+        <w:rFonts w:ascii="Wingdings" w:hAnsi="Wingdings" w:hint="default"/>
+        <w:sz w:val="20"/>
+      </w:rPr>
+    </w:lvl>
+    <w:lvl w:ilvl="8" w:tentative="1">
+      <w:start w:val="1"/>
+      <w:numFmt w:val="bullet"/>
+      <w:lvlText w:val=""/>
+      <w:lvlJc w:val="left"/>
+      <w:pPr>
+        <w:tabs>
+          <w:tab w:val="num" w:pos="6480"/>
+        </w:tabs>
+        <w:ind w:left="6480" w:hanging="360"/>
+      </w:pPr>
+      <w:rPr>
+        <w:rFonts w:ascii="Wingdings" w:hAnsi="Wingdings" w:hint="default"/>
+        <w:sz w:val="20"/>
+      </w:rPr>
+    </w:lvl>
+  </w:abstractNum>
+  <w:abstractNum w:abstractNumId="5" w15:restartNumberingAfterBreak="0">
     <w:nsid w:val="2A8F67FD"/>
     <w:multiLevelType w:val="multilevel"/>
     <w:tmpl w:val="E340BB8E"/>
@@ -5967,7 +6509,7 @@
       </w:rPr>
     </w:lvl>
   </w:abstractNum>
-  <w:abstractNum w:abstractNumId="5" w15:restartNumberingAfterBreak="0">
+  <w:abstractNum w:abstractNumId="6" w15:restartNumberingAfterBreak="0">
     <w:nsid w:val="448B4473"/>
     <w:multiLevelType w:val="multilevel"/>
     <w:tmpl w:val="5322CF4E"/>
@@ -6090,13 +6632,16 @@
     <w:abstractNumId w:val="1"/>
   </w:num>
   <w:num w:numId="4" w16cid:durableId="2001809947">
-    <w:abstractNumId w:val="4"/>
+    <w:abstractNumId w:val="5"/>
   </w:num>
   <w:num w:numId="5" w16cid:durableId="193465122">
     <w:abstractNumId w:val="2"/>
   </w:num>
   <w:num w:numId="6" w16cid:durableId="1088161423">
-    <w:abstractNumId w:val="5"/>
+    <w:abstractNumId w:val="6"/>
+  </w:num>
+  <w:num w:numId="7" w16cid:durableId="160508934">
+    <w:abstractNumId w:val="4"/>
   </w:num>
   <w:numIdMacAtCleanup w:val="5"/>
 </w:numbering>
@@ -6862,7 +7407,7 @@
       <w:lang w:val="fr-FR" w:eastAsia="fr-FR" w:bidi="ar-SA"/>
     </w:rPr>
   </w:style>
-  <w:style w:type="character" w:styleId="Lienhypertexte">
+  <w:style w:type="character" w:styleId="Hyperlien">
     <w:name w:val="Hyperlink"/>
     <w:basedOn w:val="Policepardfaut"/>
     <w:uiPriority w:val="99"/>
@@ -7512,6 +8057,21 @@
 </file>
 
 <file path=customXml/item2.xml><?xml version="1.0" encoding="utf-8"?>
+<b:Sources xmlns:b="http://schemas.openxmlformats.org/officeDocument/2006/bibliography" xmlns="http://schemas.openxmlformats.org/officeDocument/2006/bibliography" SelectedStyle="\APA.XSL" StyleName="APA"/>
+</file>
+
+<file path=customXml/item3.xml><?xml version="1.0" encoding="utf-8"?>
+<p:properties xmlns:p="http://schemas.microsoft.com/office/2006/metadata/properties" xmlns:xsi="http://www.w3.org/2001/XMLSchema-instance" xmlns:pc="http://schemas.microsoft.com/office/infopath/2007/PartnerControls">
+  <documentManagement>
+    <lcf76f155ced4ddcb4097134ff3c332f xmlns="a1b10758-7132-46a4-a2fe-7a2cf46f51f4">
+      <Terms xmlns="http://schemas.microsoft.com/office/infopath/2007/PartnerControls"/>
+    </lcf76f155ced4ddcb4097134ff3c332f>
+    <TaxCatchAll xmlns="f7d9f5a6-831d-4621-8c77-cbcaf993e406" xsi:nil="true"/>
+  </documentManagement>
+</p:properties>
+</file>
+
+<file path=customXml/item4.xml><?xml version="1.0" encoding="utf-8"?>
 <ct:contentTypeSchema xmlns:ct="http://schemas.microsoft.com/office/2006/metadata/contentType" xmlns:ma="http://schemas.microsoft.com/office/2006/metadata/properties/metaAttributes" ct:_="" ma:_="" ma:contentTypeName="Document" ma:contentTypeID="0x0101005A5B8F5EAAC22C48A11F5D9A60E6F21D" ma:contentTypeVersion="16" ma:contentTypeDescription="Crée un document." ma:contentTypeScope="" ma:versionID="f2b963976306cc54294b7f4545a3c6c4">
   <xsd:schema xmlns:xsd="http://www.w3.org/2001/XMLSchema" xmlns:xs="http://www.w3.org/2001/XMLSchema" xmlns:p="http://schemas.microsoft.com/office/2006/metadata/properties" xmlns:ns2="a1b10758-7132-46a4-a2fe-7a2cf46f51f4" xmlns:ns3="f7d9f5a6-831d-4621-8c77-cbcaf993e406" targetNamespace="http://schemas.microsoft.com/office/2006/metadata/properties" ma:root="true" ma:fieldsID="e5e135fa2fc1295e1586ddcd9c1a8904" ns2:_="" ns3:_="">
     <xsd:import namespace="a1b10758-7132-46a4-a2fe-7a2cf46f51f4"/>
@@ -7754,21 +8314,6 @@
 </ct:contentTypeSchema>
 </file>
 
-<file path=customXml/item3.xml><?xml version="1.0" encoding="utf-8"?>
-<p:properties xmlns:p="http://schemas.microsoft.com/office/2006/metadata/properties" xmlns:xsi="http://www.w3.org/2001/XMLSchema-instance" xmlns:pc="http://schemas.microsoft.com/office/infopath/2007/PartnerControls">
-  <documentManagement>
-    <lcf76f155ced4ddcb4097134ff3c332f xmlns="a1b10758-7132-46a4-a2fe-7a2cf46f51f4">
-      <Terms xmlns="http://schemas.microsoft.com/office/infopath/2007/PartnerControls"/>
-    </lcf76f155ced4ddcb4097134ff3c332f>
-    <TaxCatchAll xmlns="f7d9f5a6-831d-4621-8c77-cbcaf993e406" xsi:nil="true"/>
-  </documentManagement>
-</p:properties>
-</file>
-
-<file path=customXml/item4.xml><?xml version="1.0" encoding="utf-8"?>
-<b:Sources xmlns:b="http://schemas.openxmlformats.org/officeDocument/2006/bibliography" xmlns="http://schemas.openxmlformats.org/officeDocument/2006/bibliography" SelectedStyle="\APA.XSL" StyleName="APA"/>
-</file>
-
 <file path=customXml/itemProps1.xml><?xml version="1.0" encoding="utf-8"?>
 <ds:datastoreItem xmlns:ds="http://schemas.openxmlformats.org/officeDocument/2006/customXml" ds:itemID="{6C3F7A66-EDE3-46FD-83EB-3C265E5D2669}">
   <ds:schemaRefs>
@@ -7778,6 +8323,25 @@
 </file>
 
 <file path=customXml/itemProps2.xml><?xml version="1.0" encoding="utf-8"?>
+<ds:datastoreItem xmlns:ds="http://schemas.openxmlformats.org/officeDocument/2006/customXml" ds:itemID="{C8C35155-3E6A-4058-B6E4-303717845E3B}">
+  <ds:schemaRefs>
+    <ds:schemaRef ds:uri="http://schemas.openxmlformats.org/officeDocument/2006/bibliography"/>
+  </ds:schemaRefs>
+</ds:datastoreItem>
+</file>
+
+<file path=customXml/itemProps3.xml><?xml version="1.0" encoding="utf-8"?>
+<ds:datastoreItem xmlns:ds="http://schemas.openxmlformats.org/officeDocument/2006/customXml" ds:itemID="{2319CDB8-A2CD-412D-8359-13E6B4DF1FF4}">
+  <ds:schemaRefs>
+    <ds:schemaRef ds:uri="http://schemas.microsoft.com/office/2006/metadata/properties"/>
+    <ds:schemaRef ds:uri="http://schemas.microsoft.com/office/infopath/2007/PartnerControls"/>
+    <ds:schemaRef ds:uri="a1b10758-7132-46a4-a2fe-7a2cf46f51f4"/>
+    <ds:schemaRef ds:uri="f7d9f5a6-831d-4621-8c77-cbcaf993e406"/>
+  </ds:schemaRefs>
+</ds:datastoreItem>
+</file>
+
+<file path=customXml/itemProps4.xml><?xml version="1.0" encoding="utf-8"?>
 <ds:datastoreItem xmlns:ds="http://schemas.openxmlformats.org/officeDocument/2006/customXml" ds:itemID="{41546E4A-837A-4BEF-A4B8-FFD4EAB4E855}">
   <ds:schemaRefs>
     <ds:schemaRef ds:uri="http://schemas.microsoft.com/office/2006/metadata/contentType"/>
@@ -7794,23 +8358,4 @@
     <ds:schemaRef ds:uri="http://schemas.microsoft.com/internal/obd"/>
   </ds:schemaRefs>
 </ds:datastoreItem>
-</file>
-
-<file path=customXml/itemProps3.xml><?xml version="1.0" encoding="utf-8"?>
-<ds:datastoreItem xmlns:ds="http://schemas.openxmlformats.org/officeDocument/2006/customXml" ds:itemID="{2319CDB8-A2CD-412D-8359-13E6B4DF1FF4}">
-  <ds:schemaRefs>
-    <ds:schemaRef ds:uri="http://schemas.microsoft.com/office/2006/metadata/properties"/>
-    <ds:schemaRef ds:uri="http://schemas.microsoft.com/office/infopath/2007/PartnerControls"/>
-    <ds:schemaRef ds:uri="a1b10758-7132-46a4-a2fe-7a2cf46f51f4"/>
-    <ds:schemaRef ds:uri="f7d9f5a6-831d-4621-8c77-cbcaf993e406"/>
-  </ds:schemaRefs>
-</ds:datastoreItem>
-</file>
-
-<file path=customXml/itemProps4.xml><?xml version="1.0" encoding="utf-8"?>
-<ds:datastoreItem xmlns:ds="http://schemas.openxmlformats.org/officeDocument/2006/customXml" ds:itemID="{C8C35155-3E6A-4058-B6E4-303717845E3B}">
-  <ds:schemaRefs>
-    <ds:schemaRef ds:uri="http://schemas.openxmlformats.org/officeDocument/2006/bibliography"/>
-  </ds:schemaRefs>
-</ds:datastoreItem>
 </file>
</xml_diff>